<commit_message>
fix: resolve SK PNS template download issue
</commit_message>
<xml_diff>
--- a/public/templates/sk-kamad pns-template.docx
+++ b/public/templates/sk-kamad pns-template.docx
@@ -109,6 +109,18 @@
       <w:r>
         <w:rPr>
           <w:rFonts w:ascii="Consolas" w:hAnsi="Consolas"/>
+          <w:b/>
+          <w:bCs/>
+          <w:szCs w:val="24"/>
+          <w:lang w:val="pt-BR"/>
+        </w:rPr>
+        <w:t>{NOMOR}</w:t>
+      </w:r>
+      <w:r>
+        <w:rPr>
+          <w:rFonts w:ascii="Consolas" w:hAnsi="Consolas"/>
+          <w:b/>
+          <w:bCs/>
           <w:sz w:val="20"/>
           <w:lang w:val="pt-BR"/>
         </w:rPr>
@@ -117,6 +129,8 @@
       <w:r>
         <w:rPr>
           <w:rFonts w:ascii="Consolas" w:hAnsi="Consolas"/>
+          <w:b/>
+          <w:bCs/>
           <w:sz w:val="20"/>
           <w:lang w:val="pt-BR"/>
         </w:rPr>
@@ -125,6 +139,8 @@
       <w:r>
         <w:rPr>
           <w:rFonts w:ascii="Consolas" w:hAnsi="Consolas"/>
+          <w:b/>
+          <w:bCs/>
           <w:sz w:val="20"/>
           <w:lang w:val="pt-BR"/>
         </w:rPr>
@@ -133,14 +149,18 @@
       <w:r>
         <w:rPr>
           <w:rFonts w:ascii="Consolas" w:hAnsi="Consolas"/>
+          <w:b/>
+          <w:bCs/>
           <w:noProof/>
           <w:lang w:val="pt-BR"/>
         </w:rPr>
-        <w:t>66/PC.L/A.II/H-34.B/10/2025</w:t>
+        <w:t>/PC.L/A.II/H-34.B/{BULAN}/{TAHUN}</w:t>
       </w:r>
       <w:r>
         <w:rPr>
           <w:rFonts w:ascii="Consolas" w:hAnsi="Consolas"/>
+          <w:b/>
+          <w:bCs/>
           <w:sz w:val="20"/>
           <w:lang w:val="pt-BR"/>
         </w:rPr>
@@ -278,7 +298,7 @@
       <w:r>
         <w:rPr>
           <w:rFonts w:ascii="Arial Narrow" w:hAnsi="Arial Narrow"/>
-          <w:lang w:val="pt-BR"/>
+          <w:lang w:val="it-IT"/>
         </w:rPr>
         <w:t>P</w:t>
       </w:r>
@@ -292,7 +312,7 @@
       <w:r>
         <w:rPr>
           <w:rFonts w:ascii="Arial Narrow" w:hAnsi="Arial Narrow"/>
-          <w:lang w:val="pt-BR"/>
+          <w:lang w:val="it-IT"/>
         </w:rPr>
         <w:t xml:space="preserve"> Cabang Lembaga Pendidikan Ma’arif Nahdlatul Ulama</w:t>
       </w:r>
@@ -306,7 +326,7 @@
       <w:r>
         <w:rPr>
           <w:rFonts w:ascii="Arial Narrow" w:hAnsi="Arial Narrow"/>
-          <w:lang w:val="pt-BR"/>
+          <w:lang w:val="it-IT"/>
         </w:rPr>
         <w:t xml:space="preserve"> Cilacap setelah:</w:t>
       </w:r>
@@ -830,7 +850,13 @@
               <w:rPr>
                 <w:rFonts w:ascii="Arial Narrow" w:hAnsi="Arial Narrow"/>
               </w:rPr>
-              <w:t xml:space="preserve"> 1945;</w:t>
+              <w:t xml:space="preserve"> 1945</w:t>
+            </w:r>
+            <w:r>
+              <w:rPr>
+                <w:rFonts w:ascii="Arial Narrow" w:hAnsi="Arial Narrow"/>
+              </w:rPr>
+              <w:t>.</w:t>
             </w:r>
           </w:p>
           <w:p>
@@ -987,7 +1013,6 @@
               <w:t xml:space="preserve"> dan </w:t>
             </w:r>
             <w:proofErr w:type="spellStart"/>
-            <w:proofErr w:type="gramStart"/>
             <w:r>
               <w:rPr>
                 <w:rFonts w:ascii="Arial Narrow" w:hAnsi="Arial Narrow"/>
@@ -999,14 +1024,7 @@
               <w:rPr>
                 <w:rFonts w:ascii="Arial Narrow" w:hAnsi="Arial Narrow"/>
               </w:rPr>
-              <w:t xml:space="preserve">  di</w:t>
-            </w:r>
-            <w:proofErr w:type="gramEnd"/>
-            <w:r>
-              <w:rPr>
-                <w:rFonts w:ascii="Arial Narrow" w:hAnsi="Arial Narrow"/>
-              </w:rPr>
-              <w:t xml:space="preserve"> </w:t>
+              <w:t xml:space="preserve">  di </w:t>
             </w:r>
             <w:proofErr w:type="spellStart"/>
             <w:r>
@@ -1020,24 +1038,9 @@
               <w:rPr>
                 <w:rFonts w:ascii="Arial Narrow" w:hAnsi="Arial Narrow"/>
               </w:rPr>
-              <w:t xml:space="preserve"> </w:t>
-            </w:r>
-            <w:proofErr w:type="spellStart"/>
-            <w:r>
-              <w:rPr>
-                <w:rFonts w:ascii="Arial Narrow" w:hAnsi="Arial Narrow"/>
-              </w:rPr>
-              <w:t>Pengurus</w:t>
-            </w:r>
-            <w:proofErr w:type="spellEnd"/>
-            <w:r>
-              <w:rPr>
-                <w:rFonts w:ascii="Arial Narrow" w:hAnsi="Arial Narrow"/>
-              </w:rPr>
-              <w:t xml:space="preserve"> Cabang Lembaga Pendidikan </w:t>
-            </w:r>
-            <w:proofErr w:type="spellStart"/>
-            <w:proofErr w:type="gramStart"/>
+              <w:t xml:space="preserve"> Pengurus Cabang Lembaga Pendidikan </w:t>
+            </w:r>
+            <w:proofErr w:type="spellStart"/>
             <w:r>
               <w:rPr>
                 <w:rFonts w:ascii="Arial Narrow" w:hAnsi="Arial Narrow"/>
@@ -1049,14 +1052,7 @@
               <w:rPr>
                 <w:rFonts w:ascii="Arial Narrow" w:hAnsi="Arial Narrow"/>
               </w:rPr>
-              <w:t xml:space="preserve">  NU</w:t>
-            </w:r>
-            <w:proofErr w:type="gramEnd"/>
-            <w:r>
-              <w:rPr>
-                <w:rFonts w:ascii="Arial Narrow" w:hAnsi="Arial Narrow"/>
-              </w:rPr>
-              <w:t xml:space="preserve"> </w:t>
+              <w:t xml:space="preserve">  NU </w:t>
             </w:r>
             <w:proofErr w:type="spellStart"/>
             <w:r>
@@ -1168,24 +1164,9 @@
               <w:rPr>
                 <w:rFonts w:ascii="Arial Narrow" w:hAnsi="Arial Narrow"/>
               </w:rPr>
-              <w:t xml:space="preserve"> Surat Keputusan </w:t>
-            </w:r>
-            <w:proofErr w:type="spellStart"/>
-            <w:r>
-              <w:rPr>
-                <w:rFonts w:ascii="Arial Narrow" w:hAnsi="Arial Narrow"/>
-              </w:rPr>
-              <w:t>Pengurus</w:t>
-            </w:r>
-            <w:proofErr w:type="spellEnd"/>
-            <w:r>
-              <w:rPr>
-                <w:rFonts w:ascii="Arial Narrow" w:hAnsi="Arial Narrow"/>
-              </w:rPr>
-              <w:t xml:space="preserve"> Cabang Lembaga Pendidikan </w:t>
-            </w:r>
-            <w:proofErr w:type="spellStart"/>
-            <w:proofErr w:type="gramStart"/>
+              <w:t xml:space="preserve"> Surat Keputusan Pengurus Cabang Lembaga Pendidikan </w:t>
+            </w:r>
+            <w:proofErr w:type="spellStart"/>
             <w:r>
               <w:rPr>
                 <w:rFonts w:ascii="Arial Narrow" w:hAnsi="Arial Narrow"/>
@@ -1197,14 +1178,7 @@
               <w:rPr>
                 <w:rFonts w:ascii="Arial Narrow" w:hAnsi="Arial Narrow"/>
               </w:rPr>
-              <w:t xml:space="preserve">  NU</w:t>
-            </w:r>
-            <w:proofErr w:type="gramEnd"/>
-            <w:r>
-              <w:rPr>
-                <w:rFonts w:ascii="Arial Narrow" w:hAnsi="Arial Narrow"/>
-              </w:rPr>
-              <w:t xml:space="preserve"> </w:t>
+              <w:t xml:space="preserve">  NU </w:t>
             </w:r>
             <w:proofErr w:type="spellStart"/>
             <w:r>
@@ -1218,7 +1192,13 @@
               <w:rPr>
                 <w:rFonts w:ascii="Arial Narrow" w:hAnsi="Arial Narrow"/>
               </w:rPr>
-              <w:t xml:space="preserve"> Cilacap </w:t>
+              <w:t xml:space="preserve"> Cilacap</w:t>
+            </w:r>
+            <w:r>
+              <w:rPr>
+                <w:rFonts w:ascii="Arial Narrow" w:hAnsi="Arial Narrow"/>
+              </w:rPr>
+              <w:t>.</w:t>
             </w:r>
           </w:p>
           <w:p>
@@ -1244,38 +1224,8 @@
             <w:r>
               <w:rPr>
                 <w:rFonts w:ascii="Arial Narrow" w:hAnsi="Arial Narrow"/>
-                <w:lang w:val="id-ID"/>
-              </w:rPr>
-              <w:fldChar w:fldCharType="begin"/>
-            </w:r>
-            <w:r>
-              <w:rPr>
-                <w:rFonts w:ascii="Arial Narrow" w:hAnsi="Arial Narrow"/>
-                <w:lang w:val="id-ID"/>
-              </w:rPr>
-              <w:instrText xml:space="preserve"> MERGEFIELD "NOMOR_REKOMENDASI_KEMENAG" </w:instrText>
-            </w:r>
-            <w:r>
-              <w:rPr>
-                <w:rFonts w:ascii="Arial Narrow" w:hAnsi="Arial Narrow"/>
-                <w:lang w:val="id-ID"/>
-              </w:rPr>
-              <w:fldChar w:fldCharType="separate"/>
-            </w:r>
-            <w:r>
-              <w:rPr>
-                <w:rFonts w:ascii="Arial Narrow" w:hAnsi="Arial Narrow"/>
-                <w:noProof/>
-                <w:lang w:val="id-ID"/>
-              </w:rPr>
-              <w:t>29.012/Kk.11.01/2/PP.00.5/9/2025</w:t>
-            </w:r>
-            <w:r>
-              <w:rPr>
-                <w:rFonts w:ascii="Arial Narrow" w:hAnsi="Arial Narrow"/>
-                <w:lang w:val="id-ID"/>
-              </w:rPr>
-              <w:fldChar w:fldCharType="end"/>
+              </w:rPr>
+              <w:t>{NOMOR SURAT REKOMENDASI}</w:t>
             </w:r>
             <w:r>
               <w:rPr>
@@ -1287,38 +1237,8 @@
             <w:r>
               <w:rPr>
                 <w:rFonts w:ascii="Arial Narrow" w:hAnsi="Arial Narrow"/>
-                <w:lang w:val="id-ID"/>
-              </w:rPr>
-              <w:fldChar w:fldCharType="begin"/>
-            </w:r>
-            <w:r>
-              <w:rPr>
-                <w:rFonts w:ascii="Arial Narrow" w:hAnsi="Arial Narrow"/>
-                <w:lang w:val="id-ID"/>
-              </w:rPr>
-              <w:instrText xml:space="preserve"> MERGEFIELD "TANGGAL_REKOMENDASI" </w:instrText>
-            </w:r>
-            <w:r>
-              <w:rPr>
-                <w:rFonts w:ascii="Arial Narrow" w:hAnsi="Arial Narrow"/>
-                <w:lang w:val="id-ID"/>
-              </w:rPr>
-              <w:fldChar w:fldCharType="separate"/>
-            </w:r>
-            <w:r>
-              <w:rPr>
-                <w:rFonts w:ascii="Arial Narrow" w:hAnsi="Arial Narrow"/>
-                <w:noProof/>
-                <w:lang w:val="id-ID"/>
-              </w:rPr>
-              <w:t>29 September 2025</w:t>
-            </w:r>
-            <w:r>
-              <w:rPr>
-                <w:rFonts w:ascii="Arial Narrow" w:hAnsi="Arial Narrow"/>
-                <w:lang w:val="id-ID"/>
-              </w:rPr>
-              <w:fldChar w:fldCharType="end"/>
+              </w:rPr>
+              <w:t>{TANGGAL SURAT REKOMENDASI}</w:t>
             </w:r>
             <w:r>
               <w:rPr>
@@ -1948,25 +1868,7 @@
                 <w:color w:val="000000"/>
                 <w:lang w:eastAsia="ko-KR"/>
               </w:rPr>
-              <w:t xml:space="preserve"> </w:t>
-            </w:r>
-            <w:proofErr w:type="spellStart"/>
-            <w:r>
-              <w:rPr>
-                <w:rFonts w:ascii="Arial Narrow" w:hAnsi="Arial Narrow" w:cs="Calibri"/>
-                <w:color w:val="000000"/>
-                <w:lang w:eastAsia="ko-KR"/>
-              </w:rPr>
-              <w:t>Pengurus</w:t>
-            </w:r>
-            <w:proofErr w:type="spellEnd"/>
-            <w:r>
-              <w:rPr>
-                <w:rFonts w:ascii="Arial Narrow" w:hAnsi="Arial Narrow" w:cs="Calibri"/>
-                <w:color w:val="000000"/>
-                <w:lang w:eastAsia="ko-KR"/>
-              </w:rPr>
-              <w:t xml:space="preserve"> Pusat LP </w:t>
+              <w:t xml:space="preserve"> Pengurus Pusat LP </w:t>
             </w:r>
             <w:proofErr w:type="spellStart"/>
             <w:r>
@@ -2121,15 +2023,15 @@
               <w:rPr>
                 <w:rFonts w:ascii="Arial Narrow" w:hAnsi="Arial Narrow" w:cs="Calibri"/>
                 <w:color w:val="000000"/>
-                <w:lang w:eastAsia="ko-KR"/>
-              </w:rPr>
-            </w:pPr>
-            <w:proofErr w:type="spellStart"/>
-            <w:r>
-              <w:rPr>
-                <w:rFonts w:ascii="Arial Narrow" w:hAnsi="Arial Narrow" w:cs="Calibri"/>
-                <w:color w:val="000000"/>
-                <w:lang w:eastAsia="ko-KR"/>
+                <w:lang w:val="es-ES" w:eastAsia="ko-KR"/>
+              </w:rPr>
+            </w:pPr>
+            <w:proofErr w:type="spellStart"/>
+            <w:r>
+              <w:rPr>
+                <w:rFonts w:ascii="Arial Narrow" w:hAnsi="Arial Narrow" w:cs="Calibri"/>
+                <w:color w:val="000000"/>
+                <w:lang w:val="es-ES" w:eastAsia="ko-KR"/>
               </w:rPr>
               <w:t>Peraturan</w:t>
             </w:r>
@@ -2138,7 +2040,7 @@
               <w:rPr>
                 <w:rFonts w:ascii="Arial Narrow" w:hAnsi="Arial Narrow" w:cs="Calibri"/>
                 <w:color w:val="000000"/>
-                <w:lang w:eastAsia="ko-KR"/>
+                <w:lang w:val="es-ES" w:eastAsia="ko-KR"/>
               </w:rPr>
               <w:t xml:space="preserve"> </w:t>
             </w:r>
@@ -2147,7 +2049,7 @@
               <w:rPr>
                 <w:rFonts w:ascii="Arial Narrow" w:hAnsi="Arial Narrow" w:cs="Calibri"/>
                 <w:color w:val="000000"/>
-                <w:lang w:eastAsia="ko-KR"/>
+                <w:lang w:val="es-ES" w:eastAsia="ko-KR"/>
               </w:rPr>
               <w:t>Pengurus</w:t>
             </w:r>
@@ -2156,34 +2058,16 @@
               <w:rPr>
                 <w:rFonts w:ascii="Arial Narrow" w:hAnsi="Arial Narrow" w:cs="Calibri"/>
                 <w:color w:val="000000"/>
-                <w:lang w:eastAsia="ko-KR"/>
-              </w:rPr>
-              <w:t xml:space="preserve"> Wilayah LP </w:t>
-            </w:r>
-            <w:proofErr w:type="spellStart"/>
-            <w:r>
-              <w:rPr>
-                <w:rFonts w:ascii="Arial Narrow" w:hAnsi="Arial Narrow" w:cs="Calibri"/>
-                <w:color w:val="000000"/>
-                <w:lang w:eastAsia="ko-KR"/>
-              </w:rPr>
-              <w:t>Ma’arif</w:t>
-            </w:r>
-            <w:proofErr w:type="spellEnd"/>
-            <w:r>
-              <w:rPr>
-                <w:rFonts w:ascii="Arial Narrow" w:hAnsi="Arial Narrow" w:cs="Calibri"/>
-                <w:color w:val="000000"/>
-                <w:lang w:eastAsia="ko-KR"/>
-              </w:rPr>
-              <w:t xml:space="preserve"> NU </w:t>
-            </w:r>
-            <w:proofErr w:type="spellStart"/>
-            <w:r>
-              <w:rPr>
-                <w:rFonts w:ascii="Arial Narrow" w:hAnsi="Arial Narrow" w:cs="Calibri"/>
-                <w:color w:val="000000"/>
-                <w:lang w:eastAsia="ko-KR"/>
+                <w:lang w:val="es-ES" w:eastAsia="ko-KR"/>
+              </w:rPr>
+              <w:t xml:space="preserve"> Wilayah LP Ma’arif NU </w:t>
+            </w:r>
+            <w:proofErr w:type="spellStart"/>
+            <w:r>
+              <w:rPr>
+                <w:rFonts w:ascii="Arial Narrow" w:hAnsi="Arial Narrow" w:cs="Calibri"/>
+                <w:color w:val="000000"/>
+                <w:lang w:val="es-ES" w:eastAsia="ko-KR"/>
               </w:rPr>
               <w:t>Provinsi</w:t>
             </w:r>
@@ -2192,17 +2076,16 @@
               <w:rPr>
                 <w:rFonts w:ascii="Arial Narrow" w:hAnsi="Arial Narrow" w:cs="Calibri"/>
                 <w:color w:val="000000"/>
-                <w:lang w:eastAsia="ko-KR"/>
+                <w:lang w:val="es-ES" w:eastAsia="ko-KR"/>
               </w:rPr>
               <w:t xml:space="preserve"> Jawa Tengah </w:t>
             </w:r>
             <w:proofErr w:type="spellStart"/>
-            <w:proofErr w:type="gramStart"/>
-            <w:r>
-              <w:rPr>
-                <w:rFonts w:ascii="Arial Narrow" w:hAnsi="Arial Narrow" w:cs="Calibri"/>
-                <w:color w:val="000000"/>
-                <w:lang w:eastAsia="ko-KR"/>
+            <w:r>
+              <w:rPr>
+                <w:rFonts w:ascii="Arial Narrow" w:hAnsi="Arial Narrow" w:cs="Calibri"/>
+                <w:color w:val="000000"/>
+                <w:lang w:val="es-ES" w:eastAsia="ko-KR"/>
               </w:rPr>
               <w:t>Nomor</w:t>
             </w:r>
@@ -2211,25 +2094,16 @@
               <w:rPr>
                 <w:rFonts w:ascii="Arial Narrow" w:hAnsi="Arial Narrow" w:cs="Calibri"/>
                 <w:color w:val="000000"/>
-                <w:lang w:eastAsia="ko-KR"/>
-              </w:rPr>
-              <w:t xml:space="preserve"> :</w:t>
-            </w:r>
-            <w:proofErr w:type="gramEnd"/>
-            <w:r>
-              <w:rPr>
-                <w:rFonts w:ascii="Arial Narrow" w:hAnsi="Arial Narrow" w:cs="Calibri"/>
-                <w:color w:val="000000"/>
-                <w:lang w:eastAsia="ko-KR"/>
-              </w:rPr>
-              <w:t xml:space="preserve"> 02/PW.11/LPMNU/PPW/2014 </w:t>
-            </w:r>
-            <w:proofErr w:type="spellStart"/>
-            <w:r>
-              <w:rPr>
-                <w:rFonts w:ascii="Arial Narrow" w:hAnsi="Arial Narrow" w:cs="Calibri"/>
-                <w:color w:val="000000"/>
-                <w:lang w:eastAsia="ko-KR"/>
+                <w:lang w:val="es-ES" w:eastAsia="ko-KR"/>
+              </w:rPr>
+              <w:t xml:space="preserve"> : 02/PW.11/LPMNU/PPW/2014 </w:t>
+            </w:r>
+            <w:proofErr w:type="spellStart"/>
+            <w:r>
+              <w:rPr>
+                <w:rFonts w:ascii="Arial Narrow" w:hAnsi="Arial Narrow" w:cs="Calibri"/>
+                <w:color w:val="000000"/>
+                <w:lang w:val="es-ES" w:eastAsia="ko-KR"/>
               </w:rPr>
               <w:t>tentang</w:t>
             </w:r>
@@ -2238,7 +2112,7 @@
               <w:rPr>
                 <w:rFonts w:ascii="Arial Narrow" w:hAnsi="Arial Narrow" w:cs="Calibri"/>
                 <w:color w:val="000000"/>
-                <w:lang w:eastAsia="ko-KR"/>
+                <w:lang w:val="es-ES" w:eastAsia="ko-KR"/>
               </w:rPr>
               <w:t xml:space="preserve"> </w:t>
             </w:r>
@@ -2247,7 +2121,7 @@
               <w:rPr>
                 <w:rFonts w:ascii="Arial Narrow" w:hAnsi="Arial Narrow" w:cs="Calibri"/>
                 <w:color w:val="000000"/>
-                <w:lang w:eastAsia="ko-KR"/>
+                <w:lang w:val="es-ES" w:eastAsia="ko-KR"/>
               </w:rPr>
               <w:t>Pengelolaan</w:t>
             </w:r>
@@ -2256,27 +2130,45 @@
               <w:rPr>
                 <w:rFonts w:ascii="Arial Narrow" w:hAnsi="Arial Narrow" w:cs="Calibri"/>
                 <w:color w:val="000000"/>
-                <w:lang w:eastAsia="ko-KR"/>
-              </w:rPr>
-              <w:t xml:space="preserve"> Satuan Pendidikan </w:t>
-            </w:r>
-            <w:proofErr w:type="spellStart"/>
-            <w:r>
-              <w:rPr>
-                <w:rFonts w:ascii="Arial Narrow" w:hAnsi="Arial Narrow" w:cs="Calibri"/>
-                <w:color w:val="000000"/>
-                <w:lang w:eastAsia="ko-KR"/>
-              </w:rPr>
-              <w:t>Ma’arif</w:t>
-            </w:r>
-            <w:proofErr w:type="spellEnd"/>
-            <w:r>
-              <w:rPr>
-                <w:rFonts w:ascii="Arial Narrow" w:hAnsi="Arial Narrow" w:cs="Calibri"/>
-                <w:color w:val="000000"/>
-                <w:lang w:eastAsia="ko-KR"/>
-              </w:rPr>
-              <w:t xml:space="preserve"> NU.</w:t>
+                <w:lang w:val="es-ES" w:eastAsia="ko-KR"/>
+              </w:rPr>
+              <w:t xml:space="preserve"> </w:t>
+            </w:r>
+            <w:proofErr w:type="spellStart"/>
+            <w:r>
+              <w:rPr>
+                <w:rFonts w:ascii="Arial Narrow" w:hAnsi="Arial Narrow" w:cs="Calibri"/>
+                <w:color w:val="000000"/>
+                <w:lang w:val="es-ES" w:eastAsia="ko-KR"/>
+              </w:rPr>
+              <w:t>Satuan</w:t>
+            </w:r>
+            <w:proofErr w:type="spellEnd"/>
+            <w:r>
+              <w:rPr>
+                <w:rFonts w:ascii="Arial Narrow" w:hAnsi="Arial Narrow" w:cs="Calibri"/>
+                <w:color w:val="000000"/>
+                <w:lang w:val="es-ES" w:eastAsia="ko-KR"/>
+              </w:rPr>
+              <w:t xml:space="preserve"> </w:t>
+            </w:r>
+            <w:proofErr w:type="spellStart"/>
+            <w:r>
+              <w:rPr>
+                <w:rFonts w:ascii="Arial Narrow" w:hAnsi="Arial Narrow" w:cs="Calibri"/>
+                <w:color w:val="000000"/>
+                <w:lang w:val="es-ES" w:eastAsia="ko-KR"/>
+              </w:rPr>
+              <w:t>Pendidikan</w:t>
+            </w:r>
+            <w:proofErr w:type="spellEnd"/>
+            <w:r>
+              <w:rPr>
+                <w:rFonts w:ascii="Arial Narrow" w:hAnsi="Arial Narrow" w:cs="Calibri"/>
+                <w:color w:val="000000"/>
+                <w:lang w:val="es-ES" w:eastAsia="ko-KR"/>
+              </w:rPr>
+              <w:t xml:space="preserve"> Ma’arif NU.</w:t>
             </w:r>
           </w:p>
         </w:tc>
@@ -2335,25 +2227,7 @@
                 <w:color w:val="000000"/>
                 <w:lang w:eastAsia="ko-KR"/>
               </w:rPr>
-              <w:t xml:space="preserve">Hasil </w:t>
-            </w:r>
-            <w:proofErr w:type="spellStart"/>
-            <w:r>
-              <w:rPr>
-                <w:rFonts w:ascii="Arial Narrow" w:hAnsi="Arial Narrow" w:cs="Calibri"/>
-                <w:color w:val="000000"/>
-                <w:lang w:eastAsia="ko-KR"/>
-              </w:rPr>
-              <w:t>Konferensi</w:t>
-            </w:r>
-            <w:proofErr w:type="spellEnd"/>
-            <w:r>
-              <w:rPr>
-                <w:rFonts w:ascii="Arial Narrow" w:hAnsi="Arial Narrow" w:cs="Calibri"/>
-                <w:color w:val="000000"/>
-                <w:lang w:eastAsia="ko-KR"/>
-              </w:rPr>
-              <w:t xml:space="preserve"> Cabang PCNU Cilacap </w:t>
+              <w:t xml:space="preserve">Hasil Konferensi Cabang PCNU Cilacap </w:t>
             </w:r>
             <w:proofErr w:type="spellStart"/>
             <w:r>
@@ -2504,23 +2378,59 @@
               <w:rPr>
                 <w:rFonts w:ascii="Arial Narrow" w:hAnsi="Arial Narrow" w:cs="Calibri"/>
                 <w:color w:val="000000"/>
-                <w:lang w:eastAsia="ko-KR"/>
-              </w:rPr>
-            </w:pPr>
-            <w:r>
-              <w:rPr>
-                <w:rFonts w:ascii="Arial Narrow" w:hAnsi="Arial Narrow" w:cs="Calibri"/>
-                <w:color w:val="000000"/>
-                <w:lang w:eastAsia="ko-KR"/>
-              </w:rPr>
-              <w:t xml:space="preserve">Surat Keputusan PCNU Cilacap </w:t>
-            </w:r>
-            <w:proofErr w:type="spellStart"/>
-            <w:r>
-              <w:rPr>
-                <w:rFonts w:ascii="Arial Narrow" w:hAnsi="Arial Narrow" w:cs="Calibri"/>
-                <w:color w:val="000000"/>
-                <w:lang w:eastAsia="ko-KR"/>
+                <w:lang w:val="es-ES" w:eastAsia="ko-KR"/>
+              </w:rPr>
+            </w:pPr>
+            <w:r>
+              <w:rPr>
+                <w:rFonts w:ascii="Arial Narrow" w:hAnsi="Arial Narrow" w:cs="Calibri"/>
+                <w:color w:val="000000"/>
+                <w:lang w:val="es-ES" w:eastAsia="ko-KR"/>
+              </w:rPr>
+              <w:t xml:space="preserve">Surat </w:t>
+            </w:r>
+            <w:proofErr w:type="spellStart"/>
+            <w:r>
+              <w:rPr>
+                <w:rFonts w:ascii="Arial Narrow" w:hAnsi="Arial Narrow" w:cs="Calibri"/>
+                <w:color w:val="000000"/>
+                <w:lang w:val="es-ES" w:eastAsia="ko-KR"/>
+              </w:rPr>
+              <w:t>Keputusan</w:t>
+            </w:r>
+            <w:proofErr w:type="spellEnd"/>
+            <w:r>
+              <w:rPr>
+                <w:rFonts w:ascii="Arial Narrow" w:hAnsi="Arial Narrow" w:cs="Calibri"/>
+                <w:color w:val="000000"/>
+                <w:lang w:val="es-ES" w:eastAsia="ko-KR"/>
+              </w:rPr>
+              <w:t xml:space="preserve"> PCNU </w:t>
+            </w:r>
+            <w:proofErr w:type="spellStart"/>
+            <w:r>
+              <w:rPr>
+                <w:rFonts w:ascii="Arial Narrow" w:hAnsi="Arial Narrow" w:cs="Calibri"/>
+                <w:color w:val="000000"/>
+                <w:lang w:val="es-ES" w:eastAsia="ko-KR"/>
+              </w:rPr>
+              <w:t>Cilacap</w:t>
+            </w:r>
+            <w:proofErr w:type="spellEnd"/>
+            <w:r>
+              <w:rPr>
+                <w:rFonts w:ascii="Arial Narrow" w:hAnsi="Arial Narrow" w:cs="Calibri"/>
+                <w:color w:val="000000"/>
+                <w:lang w:val="es-ES" w:eastAsia="ko-KR"/>
+              </w:rPr>
+              <w:t xml:space="preserve"> </w:t>
+            </w:r>
+            <w:proofErr w:type="spellStart"/>
+            <w:r>
+              <w:rPr>
+                <w:rFonts w:ascii="Arial Narrow" w:hAnsi="Arial Narrow" w:cs="Calibri"/>
+                <w:color w:val="000000"/>
+                <w:lang w:val="es-ES" w:eastAsia="ko-KR"/>
               </w:rPr>
               <w:t>Nomor</w:t>
             </w:r>
@@ -2529,34 +2439,16 @@
               <w:rPr>
                 <w:rFonts w:ascii="Arial Narrow" w:hAnsi="Arial Narrow" w:cs="Calibri"/>
                 <w:color w:val="000000"/>
-                <w:lang w:eastAsia="ko-KR"/>
-              </w:rPr>
-              <w:t xml:space="preserve"> 0046/PC/</w:t>
-            </w:r>
-            <w:proofErr w:type="gramStart"/>
-            <w:r>
-              <w:rPr>
-                <w:rFonts w:ascii="Arial Narrow" w:hAnsi="Arial Narrow" w:cs="Calibri"/>
-                <w:color w:val="000000"/>
-                <w:lang w:eastAsia="ko-KR"/>
-              </w:rPr>
-              <w:t>A.II</w:t>
-            </w:r>
-            <w:proofErr w:type="gramEnd"/>
-            <w:r>
-              <w:rPr>
-                <w:rFonts w:ascii="Arial Narrow" w:hAnsi="Arial Narrow" w:cs="Calibri"/>
-                <w:color w:val="000000"/>
-                <w:lang w:eastAsia="ko-KR"/>
-              </w:rPr>
-              <w:t xml:space="preserve">/H-34/07/2024 </w:t>
-            </w:r>
-            <w:proofErr w:type="spellStart"/>
-            <w:r>
-              <w:rPr>
-                <w:rFonts w:ascii="Arial Narrow" w:hAnsi="Arial Narrow" w:cs="Calibri"/>
-                <w:color w:val="000000"/>
-                <w:lang w:eastAsia="ko-KR"/>
+                <w:lang w:val="es-ES" w:eastAsia="ko-KR"/>
+              </w:rPr>
+              <w:t xml:space="preserve"> 0046/PC/A.II/H-34/07/2024 </w:t>
+            </w:r>
+            <w:proofErr w:type="spellStart"/>
+            <w:r>
+              <w:rPr>
+                <w:rFonts w:ascii="Arial Narrow" w:hAnsi="Arial Narrow" w:cs="Calibri"/>
+                <w:color w:val="000000"/>
+                <w:lang w:val="es-ES" w:eastAsia="ko-KR"/>
               </w:rPr>
               <w:t>tentang</w:t>
             </w:r>
@@ -2565,7 +2457,7 @@
               <w:rPr>
                 <w:rFonts w:ascii="Arial Narrow" w:hAnsi="Arial Narrow" w:cs="Calibri"/>
                 <w:color w:val="000000"/>
-                <w:lang w:eastAsia="ko-KR"/>
+                <w:lang w:val="es-ES" w:eastAsia="ko-KR"/>
               </w:rPr>
               <w:t xml:space="preserve"> </w:t>
             </w:r>
@@ -2574,7 +2466,7 @@
               <w:rPr>
                 <w:rFonts w:ascii="Arial Narrow" w:hAnsi="Arial Narrow" w:cs="Calibri"/>
                 <w:color w:val="000000"/>
-                <w:lang w:eastAsia="ko-KR"/>
+                <w:lang w:val="es-ES" w:eastAsia="ko-KR"/>
               </w:rPr>
               <w:t>Pengesahan</w:t>
             </w:r>
@@ -2583,7 +2475,7 @@
               <w:rPr>
                 <w:rFonts w:ascii="Arial Narrow" w:hAnsi="Arial Narrow" w:cs="Calibri"/>
                 <w:color w:val="000000"/>
-                <w:lang w:eastAsia="ko-KR"/>
+                <w:lang w:val="es-ES" w:eastAsia="ko-KR"/>
               </w:rPr>
               <w:t xml:space="preserve"> </w:t>
             </w:r>
@@ -2592,7 +2484,7 @@
               <w:rPr>
                 <w:rFonts w:ascii="Arial Narrow" w:hAnsi="Arial Narrow" w:cs="Calibri"/>
                 <w:color w:val="000000"/>
-                <w:lang w:eastAsia="ko-KR"/>
+                <w:lang w:val="es-ES" w:eastAsia="ko-KR"/>
               </w:rPr>
               <w:t>Pengurus</w:t>
             </w:r>
@@ -2601,52 +2493,70 @@
               <w:rPr>
                 <w:rFonts w:ascii="Arial Narrow" w:hAnsi="Arial Narrow" w:cs="Calibri"/>
                 <w:color w:val="000000"/>
-                <w:lang w:eastAsia="ko-KR"/>
-              </w:rPr>
-              <w:t xml:space="preserve"> Cabang Lembaga Pendidikan </w:t>
-            </w:r>
-            <w:proofErr w:type="spellStart"/>
-            <w:r>
-              <w:rPr>
-                <w:rFonts w:ascii="Arial Narrow" w:hAnsi="Arial Narrow" w:cs="Calibri"/>
-                <w:color w:val="000000"/>
-                <w:lang w:eastAsia="ko-KR"/>
-              </w:rPr>
-              <w:t>Ma’arif</w:t>
-            </w:r>
-            <w:proofErr w:type="spellEnd"/>
-            <w:r>
-              <w:rPr>
-                <w:rFonts w:ascii="Arial Narrow" w:hAnsi="Arial Narrow" w:cs="Calibri"/>
-                <w:color w:val="000000"/>
-                <w:lang w:eastAsia="ko-KR"/>
-              </w:rPr>
-              <w:t xml:space="preserve"> NU Cilacap Masa </w:t>
-            </w:r>
-            <w:proofErr w:type="spellStart"/>
-            <w:r>
-              <w:rPr>
-                <w:rFonts w:ascii="Arial Narrow" w:hAnsi="Arial Narrow" w:cs="Calibri"/>
-                <w:color w:val="000000"/>
-                <w:lang w:eastAsia="ko-KR"/>
-              </w:rPr>
-              <w:t>Hidmah</w:t>
-            </w:r>
-            <w:proofErr w:type="spellEnd"/>
-            <w:r>
-              <w:rPr>
-                <w:rFonts w:ascii="Arial Narrow" w:hAnsi="Arial Narrow" w:cs="Calibri"/>
-                <w:color w:val="000000"/>
-                <w:lang w:eastAsia="ko-KR"/>
-              </w:rPr>
-              <w:t xml:space="preserve"> 2024 – 2029 </w:t>
-            </w:r>
-            <w:proofErr w:type="spellStart"/>
-            <w:r>
-              <w:rPr>
-                <w:rFonts w:ascii="Arial Narrow" w:hAnsi="Arial Narrow" w:cs="Calibri"/>
-                <w:color w:val="000000"/>
-                <w:lang w:eastAsia="ko-KR"/>
+                <w:lang w:val="es-ES" w:eastAsia="ko-KR"/>
+              </w:rPr>
+              <w:t xml:space="preserve"> </w:t>
+            </w:r>
+            <w:proofErr w:type="spellStart"/>
+            <w:r>
+              <w:rPr>
+                <w:rFonts w:ascii="Arial Narrow" w:hAnsi="Arial Narrow" w:cs="Calibri"/>
+                <w:color w:val="000000"/>
+                <w:lang w:val="es-ES" w:eastAsia="ko-KR"/>
+              </w:rPr>
+              <w:t>Cabang</w:t>
+            </w:r>
+            <w:proofErr w:type="spellEnd"/>
+            <w:r>
+              <w:rPr>
+                <w:rFonts w:ascii="Arial Narrow" w:hAnsi="Arial Narrow" w:cs="Calibri"/>
+                <w:color w:val="000000"/>
+                <w:lang w:val="es-ES" w:eastAsia="ko-KR"/>
+              </w:rPr>
+              <w:t xml:space="preserve"> Lembaga </w:t>
+            </w:r>
+            <w:proofErr w:type="spellStart"/>
+            <w:r>
+              <w:rPr>
+                <w:rFonts w:ascii="Arial Narrow" w:hAnsi="Arial Narrow" w:cs="Calibri"/>
+                <w:color w:val="000000"/>
+                <w:lang w:val="es-ES" w:eastAsia="ko-KR"/>
+              </w:rPr>
+              <w:t>Pendidikan</w:t>
+            </w:r>
+            <w:proofErr w:type="spellEnd"/>
+            <w:r>
+              <w:rPr>
+                <w:rFonts w:ascii="Arial Narrow" w:hAnsi="Arial Narrow" w:cs="Calibri"/>
+                <w:color w:val="000000"/>
+                <w:lang w:val="es-ES" w:eastAsia="ko-KR"/>
+              </w:rPr>
+              <w:t xml:space="preserve"> Ma’arif NU </w:t>
+            </w:r>
+            <w:proofErr w:type="spellStart"/>
+            <w:r>
+              <w:rPr>
+                <w:rFonts w:ascii="Arial Narrow" w:hAnsi="Arial Narrow" w:cs="Calibri"/>
+                <w:color w:val="000000"/>
+                <w:lang w:val="es-ES" w:eastAsia="ko-KR"/>
+              </w:rPr>
+              <w:t>Cilacap</w:t>
+            </w:r>
+            <w:proofErr w:type="spellEnd"/>
+            <w:r>
+              <w:rPr>
+                <w:rFonts w:ascii="Arial Narrow" w:hAnsi="Arial Narrow" w:cs="Calibri"/>
+                <w:color w:val="000000"/>
+                <w:lang w:val="es-ES" w:eastAsia="ko-KR"/>
+              </w:rPr>
+              <w:t xml:space="preserve"> Masa Hidmah 2024 – 2029 </w:t>
+            </w:r>
+            <w:proofErr w:type="spellStart"/>
+            <w:r>
+              <w:rPr>
+                <w:rFonts w:ascii="Arial Narrow" w:hAnsi="Arial Narrow" w:cs="Calibri"/>
+                <w:color w:val="000000"/>
+                <w:lang w:val="es-ES" w:eastAsia="ko-KR"/>
               </w:rPr>
               <w:t>Tanggal</w:t>
             </w:r>
@@ -2655,17 +2565,9 @@
               <w:rPr>
                 <w:rFonts w:ascii="Arial Narrow" w:hAnsi="Arial Narrow" w:cs="Calibri"/>
                 <w:color w:val="000000"/>
-                <w:lang w:eastAsia="ko-KR"/>
-              </w:rPr>
-              <w:t xml:space="preserve"> 30 Juni 2024</w:t>
-            </w:r>
-            <w:r>
-              <w:rPr>
-                <w:rFonts w:ascii="Arial Narrow" w:hAnsi="Arial Narrow" w:cs="Calibri"/>
-                <w:color w:val="000000"/>
-                <w:lang w:eastAsia="ko-KR"/>
-              </w:rPr>
-              <w:t>.</w:t>
+                <w:lang w:val="es-ES" w:eastAsia="ko-KR"/>
+              </w:rPr>
+              <w:t xml:space="preserve"> 30 Juni 2024.</w:t>
             </w:r>
           </w:p>
         </w:tc>
@@ -2753,25 +2655,7 @@
                 <w:color w:val="000000"/>
                 <w:lang w:eastAsia="ko-KR"/>
               </w:rPr>
-              <w:t xml:space="preserve"> </w:t>
-            </w:r>
-            <w:proofErr w:type="spellStart"/>
-            <w:r>
-              <w:rPr>
-                <w:rFonts w:ascii="Arial Narrow" w:hAnsi="Arial Narrow" w:cs="Calibri"/>
-                <w:color w:val="000000"/>
-                <w:lang w:eastAsia="ko-KR"/>
-              </w:rPr>
-              <w:t>Pengurus</w:t>
-            </w:r>
-            <w:proofErr w:type="spellEnd"/>
-            <w:r>
-              <w:rPr>
-                <w:rFonts w:ascii="Arial Narrow" w:hAnsi="Arial Narrow" w:cs="Calibri"/>
-                <w:color w:val="000000"/>
-                <w:lang w:eastAsia="ko-KR"/>
-              </w:rPr>
-              <w:t xml:space="preserve"> Cabang Lembaga Pendidikan </w:t>
+              <w:t xml:space="preserve"> Pengurus Cabang Lembaga Pendidikan </w:t>
             </w:r>
             <w:proofErr w:type="spellStart"/>
             <w:r>
@@ -2889,118 +2773,22 @@
               <w:rPr>
                 <w:rFonts w:ascii="Arial Narrow" w:hAnsi="Arial Narrow" w:cs="Calibri"/>
                 <w:color w:val="000000"/>
-                <w:lang w:eastAsia="ko-KR"/>
-              </w:rPr>
-            </w:pPr>
-            <w:r>
-              <w:rPr>
-                <w:rFonts w:ascii="Arial Narrow" w:hAnsi="Arial Narrow" w:cs="Calibri"/>
-                <w:color w:val="000000"/>
-                <w:lang w:eastAsia="ko-KR"/>
-              </w:rPr>
-              <w:t xml:space="preserve">Program </w:t>
-            </w:r>
-            <w:proofErr w:type="spellStart"/>
-            <w:r>
-              <w:rPr>
-                <w:rFonts w:ascii="Arial Narrow" w:hAnsi="Arial Narrow" w:cs="Calibri"/>
-                <w:color w:val="000000"/>
-                <w:lang w:eastAsia="ko-KR"/>
-              </w:rPr>
-              <w:t>Kerja</w:t>
-            </w:r>
-            <w:proofErr w:type="spellEnd"/>
-            <w:r>
-              <w:rPr>
-                <w:rFonts w:ascii="Arial Narrow" w:hAnsi="Arial Narrow" w:cs="Calibri"/>
-                <w:color w:val="000000"/>
-                <w:lang w:eastAsia="ko-KR"/>
-              </w:rPr>
-              <w:t xml:space="preserve"> </w:t>
-            </w:r>
-            <w:proofErr w:type="spellStart"/>
-            <w:r>
-              <w:rPr>
-                <w:rFonts w:ascii="Arial Narrow" w:hAnsi="Arial Narrow" w:cs="Calibri"/>
-                <w:color w:val="000000"/>
-                <w:lang w:eastAsia="ko-KR"/>
-              </w:rPr>
-              <w:t>Pengurus</w:t>
-            </w:r>
-            <w:proofErr w:type="spellEnd"/>
-            <w:r>
-              <w:rPr>
-                <w:rFonts w:ascii="Arial Narrow" w:hAnsi="Arial Narrow" w:cs="Calibri"/>
-                <w:color w:val="000000"/>
-                <w:lang w:eastAsia="ko-KR"/>
-              </w:rPr>
-              <w:t xml:space="preserve"> Cabang Lembaga Pendidikan </w:t>
-            </w:r>
-            <w:proofErr w:type="spellStart"/>
-            <w:r>
-              <w:rPr>
-                <w:rFonts w:ascii="Arial Narrow" w:hAnsi="Arial Narrow" w:cs="Calibri"/>
-                <w:color w:val="000000"/>
-                <w:lang w:eastAsia="ko-KR"/>
-              </w:rPr>
-              <w:t>Ma’arif</w:t>
-            </w:r>
-            <w:proofErr w:type="spellEnd"/>
-            <w:r>
-              <w:rPr>
-                <w:rFonts w:ascii="Arial Narrow" w:hAnsi="Arial Narrow" w:cs="Calibri"/>
-                <w:color w:val="000000"/>
-                <w:lang w:eastAsia="ko-KR"/>
-              </w:rPr>
-              <w:t xml:space="preserve"> NU Cilacap Masa </w:t>
-            </w:r>
-            <w:proofErr w:type="spellStart"/>
-            <w:r>
-              <w:rPr>
-                <w:rFonts w:ascii="Arial Narrow" w:hAnsi="Arial Narrow" w:cs="Calibri"/>
-                <w:color w:val="000000"/>
-                <w:lang w:eastAsia="ko-KR"/>
-              </w:rPr>
-              <w:t>Khidmat</w:t>
-            </w:r>
-            <w:proofErr w:type="spellEnd"/>
-            <w:r>
-              <w:rPr>
-                <w:rFonts w:ascii="Arial Narrow" w:hAnsi="Arial Narrow" w:cs="Calibri"/>
-                <w:color w:val="000000"/>
-                <w:lang w:eastAsia="ko-KR"/>
-              </w:rPr>
-              <w:t xml:space="preserve"> 20</w:t>
-            </w:r>
-            <w:r>
-              <w:rPr>
-                <w:rFonts w:ascii="Arial Narrow" w:hAnsi="Arial Narrow" w:cs="Calibri"/>
-                <w:color w:val="000000"/>
-                <w:lang w:eastAsia="ko-KR"/>
-              </w:rPr>
-              <w:t>24</w:t>
-            </w:r>
-            <w:r>
-              <w:rPr>
-                <w:rFonts w:ascii="Arial Narrow" w:hAnsi="Arial Narrow" w:cs="Calibri"/>
-                <w:color w:val="000000"/>
-                <w:lang w:eastAsia="ko-KR"/>
-              </w:rPr>
-              <w:t>-202</w:t>
-            </w:r>
-            <w:r>
-              <w:rPr>
-                <w:rFonts w:ascii="Arial Narrow" w:hAnsi="Arial Narrow" w:cs="Calibri"/>
-                <w:color w:val="000000"/>
-                <w:lang w:eastAsia="ko-KR"/>
-              </w:rPr>
-              <w:t>9</w:t>
-            </w:r>
-            <w:r>
-              <w:rPr>
-                <w:rFonts w:ascii="Arial Narrow" w:hAnsi="Arial Narrow" w:cs="Calibri"/>
-                <w:color w:val="000000"/>
-                <w:lang w:eastAsia="ko-KR"/>
+                <w:lang w:val="pt-BR" w:eastAsia="ko-KR"/>
+              </w:rPr>
+            </w:pPr>
+            <w:r>
+              <w:rPr>
+                <w:rFonts w:ascii="Arial Narrow" w:hAnsi="Arial Narrow" w:cs="Calibri"/>
+                <w:color w:val="000000"/>
+                <w:lang w:val="pt-BR" w:eastAsia="ko-KR"/>
+              </w:rPr>
+              <w:t>Program Kerja Pengurus Cabang Lembaga Pendidikan Ma’arif NU Cilacap Masa Khidmat 2024-2029</w:t>
+            </w:r>
+            <w:r>
+              <w:rPr>
+                <w:rFonts w:ascii="Arial Narrow" w:hAnsi="Arial Narrow" w:cs="Calibri"/>
+                <w:color w:val="000000"/>
+                <w:lang w:val="pt-BR" w:eastAsia="ko-KR"/>
               </w:rPr>
               <w:t>.</w:t>
             </w:r>
@@ -3200,83 +2988,53 @@
               <w:rPr>
                 <w:rFonts w:ascii="Arial Narrow" w:hAnsi="Arial Narrow"/>
               </w:rPr>
-              <w:fldChar w:fldCharType="begin"/>
-            </w:r>
-            <w:r>
-              <w:rPr>
-                <w:rFonts w:ascii="Arial Narrow" w:hAnsi="Arial Narrow"/>
-              </w:rPr>
-              <w:instrText xml:space="preserve"> MERGEFIELD "NAMA_MADRASAH" </w:instrText>
-            </w:r>
-            <w:r>
-              <w:rPr>
-                <w:rFonts w:ascii="Arial Narrow" w:hAnsi="Arial Narrow"/>
-              </w:rPr>
-              <w:fldChar w:fldCharType="separate"/>
-            </w:r>
-            <w:r>
-              <w:rPr>
-                <w:rFonts w:ascii="Arial Narrow" w:hAnsi="Arial Narrow"/>
-                <w:noProof/>
-              </w:rPr>
-              <w:t>MI Ma’arif 03 Gentasari</w:t>
-            </w:r>
-            <w:r>
-              <w:rPr>
-                <w:rFonts w:ascii="Arial Narrow" w:hAnsi="Arial Narrow"/>
-              </w:rPr>
-              <w:fldChar w:fldCharType="end"/>
-            </w:r>
+              <w:t xml:space="preserve">{UNIT KERJA} </w:t>
+            </w:r>
+            <w:proofErr w:type="spellStart"/>
+            <w:r>
+              <w:rPr>
+                <w:rFonts w:ascii="Arial Narrow" w:hAnsi="Arial Narrow"/>
+              </w:rPr>
+              <w:t>Kecamatan</w:t>
+            </w:r>
+            <w:proofErr w:type="spellEnd"/>
             <w:r>
               <w:rPr>
                 <w:rFonts w:ascii="Arial Narrow" w:hAnsi="Arial Narrow"/>
               </w:rPr>
               <w:t xml:space="preserve"> </w:t>
             </w:r>
-            <w:proofErr w:type="spellStart"/>
-            <w:r>
-              <w:rPr>
-                <w:rFonts w:ascii="Arial Narrow" w:hAnsi="Arial Narrow"/>
-              </w:rPr>
-              <w:t>Kecamatan</w:t>
-            </w:r>
-            <w:proofErr w:type="spellEnd"/>
+            <w:r>
+              <w:rPr>
+                <w:rFonts w:ascii="Arial Narrow" w:hAnsi="Arial Narrow"/>
+              </w:rPr>
+              <w:t>{KECAMATAN}</w:t>
+            </w:r>
             <w:r>
               <w:rPr>
                 <w:rFonts w:ascii="Arial Narrow" w:hAnsi="Arial Narrow"/>
               </w:rPr>
               <w:t xml:space="preserve"> </w:t>
             </w:r>
-            <w:r>
-              <w:rPr>
-                <w:rFonts w:ascii="Arial Narrow" w:hAnsi="Arial Narrow"/>
-              </w:rPr>
-              <w:fldChar w:fldCharType="begin"/>
-            </w:r>
-            <w:r>
-              <w:rPr>
-                <w:rFonts w:ascii="Arial Narrow" w:hAnsi="Arial Narrow"/>
-              </w:rPr>
-              <w:instrText xml:space="preserve"> MERGEFIELD "KECAMATAN" </w:instrText>
-            </w:r>
-            <w:r>
-              <w:rPr>
-                <w:rFonts w:ascii="Arial Narrow" w:hAnsi="Arial Narrow"/>
-              </w:rPr>
-              <w:fldChar w:fldCharType="separate"/>
-            </w:r>
-            <w:r>
-              <w:rPr>
-                <w:rFonts w:ascii="Arial Narrow" w:hAnsi="Arial Narrow"/>
-                <w:noProof/>
-              </w:rPr>
-              <w:t>Kroya</w:t>
-            </w:r>
-            <w:r>
-              <w:rPr>
-                <w:rFonts w:ascii="Arial Narrow" w:hAnsi="Arial Narrow"/>
-              </w:rPr>
-              <w:fldChar w:fldCharType="end"/>
+            <w:proofErr w:type="spellStart"/>
+            <w:r>
+              <w:rPr>
+                <w:rFonts w:ascii="Arial Narrow" w:hAnsi="Arial Narrow"/>
+              </w:rPr>
+              <w:t>Nomor</w:t>
+            </w:r>
+            <w:proofErr w:type="spellEnd"/>
+            <w:r>
+              <w:rPr>
+                <w:rFonts w:ascii="Arial Narrow" w:hAnsi="Arial Narrow"/>
+              </w:rPr>
+              <w:t xml:space="preserve">: </w:t>
+            </w:r>
+            <w:r>
+              <w:rPr>
+                <w:rFonts w:ascii="Arial Narrow" w:hAnsi="Arial Narrow"/>
+              </w:rPr>
+              <w:t>{NOMOR SURAT PERMOHONAN}</w:t>
             </w:r>
             <w:r>
               <w:rPr>
@@ -3289,96 +3047,20 @@
               <w:rPr>
                 <w:rFonts w:ascii="Arial Narrow" w:hAnsi="Arial Narrow"/>
               </w:rPr>
-              <w:t>Nomor</w:t>
-            </w:r>
-            <w:proofErr w:type="spellEnd"/>
-            <w:r>
-              <w:rPr>
-                <w:rFonts w:ascii="Arial Narrow" w:hAnsi="Arial Narrow"/>
-              </w:rPr>
-              <w:t xml:space="preserve">: </w:t>
-            </w:r>
-            <w:r>
-              <w:rPr>
-                <w:rFonts w:ascii="Arial Narrow" w:hAnsi="Arial Narrow"/>
-              </w:rPr>
-              <w:fldChar w:fldCharType="begin"/>
-            </w:r>
-            <w:r>
-              <w:rPr>
-                <w:rFonts w:ascii="Arial Narrow" w:hAnsi="Arial Narrow"/>
-              </w:rPr>
-              <w:instrText xml:space="preserve"> MERGEFIELD "NOMOR_PERSETUJUAN" </w:instrText>
-            </w:r>
-            <w:r>
-              <w:rPr>
-                <w:rFonts w:ascii="Arial Narrow" w:hAnsi="Arial Narrow"/>
-              </w:rPr>
-              <w:fldChar w:fldCharType="separate"/>
-            </w:r>
-            <w:r>
-              <w:rPr>
-                <w:rFonts w:ascii="Arial Narrow" w:hAnsi="Arial Narrow"/>
-                <w:noProof/>
-              </w:rPr>
-              <w:t>060/MI.NU.03/34.07/SP/VIII/2025</w:t>
-            </w:r>
-            <w:r>
-              <w:rPr>
-                <w:rFonts w:ascii="Arial Narrow" w:hAnsi="Arial Narrow"/>
-              </w:rPr>
-              <w:fldChar w:fldCharType="end"/>
-            </w:r>
+              <w:t>tertanggal</w:t>
+            </w:r>
+            <w:proofErr w:type="spellEnd"/>
             <w:r>
               <w:rPr>
                 <w:rFonts w:ascii="Arial Narrow" w:hAnsi="Arial Narrow"/>
               </w:rPr>
               <w:t xml:space="preserve"> </w:t>
             </w:r>
-            <w:proofErr w:type="spellStart"/>
-            <w:r>
-              <w:rPr>
-                <w:rFonts w:ascii="Arial Narrow" w:hAnsi="Arial Narrow"/>
-              </w:rPr>
-              <w:t>tertanggal</w:t>
-            </w:r>
-            <w:proofErr w:type="spellEnd"/>
-            <w:r>
-              <w:rPr>
-                <w:rFonts w:ascii="Arial Narrow" w:hAnsi="Arial Narrow"/>
-              </w:rPr>
-              <w:t xml:space="preserve"> </w:t>
-            </w:r>
-            <w:r>
-              <w:rPr>
-                <w:rFonts w:ascii="Arial Narrow" w:hAnsi="Arial Narrow"/>
-              </w:rPr>
-              <w:fldChar w:fldCharType="begin"/>
-            </w:r>
-            <w:r>
-              <w:rPr>
-                <w:rFonts w:ascii="Arial Narrow" w:hAnsi="Arial Narrow"/>
-              </w:rPr>
-              <w:instrText xml:space="preserve"> MERGEFIELD "TANGGAL_PENGAJUAN" </w:instrText>
-            </w:r>
-            <w:r>
-              <w:rPr>
-                <w:rFonts w:ascii="Arial Narrow" w:hAnsi="Arial Narrow"/>
-              </w:rPr>
-              <w:fldChar w:fldCharType="separate"/>
-            </w:r>
-            <w:r>
-              <w:rPr>
-                <w:rFonts w:ascii="Arial Narrow" w:hAnsi="Arial Narrow"/>
-                <w:noProof/>
-              </w:rPr>
-              <w:t>09 Oktober 2025</w:t>
-            </w:r>
-            <w:r>
-              <w:rPr>
-                <w:rFonts w:ascii="Arial Narrow" w:hAnsi="Arial Narrow"/>
-              </w:rPr>
-              <w:fldChar w:fldCharType="end"/>
+            <w:r>
+              <w:rPr>
+                <w:rFonts w:ascii="Arial Narrow" w:hAnsi="Arial Narrow"/>
+              </w:rPr>
+              <w:t>{TANGGAL SURAT PERMOHONAN}</w:t>
             </w:r>
             <w:r>
               <w:rPr>
@@ -3696,40 +3378,7 @@
                 <w:b/>
                 <w:lang w:val="id-ID"/>
               </w:rPr>
-              <w:fldChar w:fldCharType="begin"/>
-            </w:r>
-            <w:r>
-              <w:rPr>
-                <w:rFonts w:ascii="Arial Narrow" w:hAnsi="Arial Narrow"/>
-                <w:b/>
-                <w:lang w:val="id-ID"/>
-              </w:rPr>
-              <w:instrText xml:space="preserve"> MERGEFIELD "NAMA_KEPALA_" </w:instrText>
-            </w:r>
-            <w:r>
-              <w:rPr>
-                <w:rFonts w:ascii="Arial Narrow" w:hAnsi="Arial Narrow"/>
-                <w:b/>
-                <w:lang w:val="id-ID"/>
-              </w:rPr>
-              <w:fldChar w:fldCharType="separate"/>
-            </w:r>
-            <w:r>
-              <w:rPr>
-                <w:rFonts w:ascii="Arial Narrow" w:hAnsi="Arial Narrow"/>
-                <w:b/>
-                <w:noProof/>
-                <w:lang w:val="id-ID"/>
-              </w:rPr>
-              <w:t>SITI FATONAH, S.Pd.I</w:t>
-            </w:r>
-            <w:r>
-              <w:rPr>
-                <w:rFonts w:ascii="Arial Narrow" w:hAnsi="Arial Narrow"/>
-                <w:b/>
-                <w:lang w:val="id-ID"/>
-              </w:rPr>
-              <w:fldChar w:fldCharType="end"/>
+              <w:t>{NAMA}</w:t>
             </w:r>
           </w:p>
         </w:tc>
@@ -3835,36 +3484,7 @@
                 <w:rFonts w:ascii="Arial Narrow" w:hAnsi="Arial Narrow"/>
                 <w:lang w:val="id-ID"/>
               </w:rPr>
-              <w:fldChar w:fldCharType="begin"/>
-            </w:r>
-            <w:r>
-              <w:rPr>
-                <w:rFonts w:ascii="Arial Narrow" w:hAnsi="Arial Narrow"/>
-                <w:lang w:val="id-ID"/>
-              </w:rPr>
-              <w:instrText xml:space="preserve"> MERGEFIELD "TEMPAT_TANGGAL_LAHIR_" </w:instrText>
-            </w:r>
-            <w:r>
-              <w:rPr>
-                <w:rFonts w:ascii="Arial Narrow" w:hAnsi="Arial Narrow"/>
-                <w:lang w:val="id-ID"/>
-              </w:rPr>
-              <w:fldChar w:fldCharType="separate"/>
-            </w:r>
-            <w:r>
-              <w:rPr>
-                <w:rFonts w:ascii="Arial Narrow" w:hAnsi="Arial Narrow"/>
-                <w:noProof/>
-                <w:lang w:val="id-ID"/>
-              </w:rPr>
-              <w:t>Cilacap,15 Februari 1971</w:t>
-            </w:r>
-            <w:r>
-              <w:rPr>
-                <w:rFonts w:ascii="Arial Narrow" w:hAnsi="Arial Narrow"/>
-                <w:lang w:val="id-ID"/>
-              </w:rPr>
-              <w:fldChar w:fldCharType="end"/>
+              <w:t>{TEMPAT, TANGGAL LAHIR}</w:t>
             </w:r>
           </w:p>
         </w:tc>
@@ -3971,36 +3591,7 @@
                 <w:rFonts w:ascii="Arial Narrow" w:hAnsi="Arial Narrow"/>
                 <w:lang w:val="id-ID"/>
               </w:rPr>
-              <w:fldChar w:fldCharType="begin"/>
-            </w:r>
-            <w:r>
-              <w:rPr>
-                <w:rFonts w:ascii="Arial Narrow" w:hAnsi="Arial Narrow"/>
-                <w:lang w:val="id-ID"/>
-              </w:rPr>
-              <w:instrText xml:space="preserve"> MERGEFIELD "NOMOR_INDUK_MAARIF_" </w:instrText>
-            </w:r>
-            <w:r>
-              <w:rPr>
-                <w:rFonts w:ascii="Arial Narrow" w:hAnsi="Arial Narrow"/>
-                <w:lang w:val="id-ID"/>
-              </w:rPr>
-              <w:fldChar w:fldCharType="separate"/>
-            </w:r>
-            <w:r>
-              <w:rPr>
-                <w:rFonts w:ascii="Arial Narrow" w:hAnsi="Arial Narrow"/>
-                <w:noProof/>
-                <w:lang w:val="id-ID"/>
-              </w:rPr>
-              <w:t>113403771</w:t>
-            </w:r>
-            <w:r>
-              <w:rPr>
-                <w:rFonts w:ascii="Arial Narrow" w:hAnsi="Arial Narrow"/>
-                <w:lang w:val="id-ID"/>
-              </w:rPr>
-              <w:fldChar w:fldCharType="end"/>
+              <w:t>{NOMOR INDUK MA’ARIF}</w:t>
             </w:r>
           </w:p>
         </w:tc>
@@ -4105,32 +3696,7 @@
               <w:rPr>
                 <w:rFonts w:ascii="Arial Narrow" w:hAnsi="Arial Narrow"/>
               </w:rPr>
-              <w:fldChar w:fldCharType="begin"/>
-            </w:r>
-            <w:r>
-              <w:rPr>
-                <w:rFonts w:ascii="Arial Narrow" w:hAnsi="Arial Narrow"/>
-              </w:rPr>
-              <w:instrText xml:space="preserve"> MERGEFIELD "PENDIDIKAN" </w:instrText>
-            </w:r>
-            <w:r>
-              <w:rPr>
-                <w:rFonts w:ascii="Arial Narrow" w:hAnsi="Arial Narrow"/>
-              </w:rPr>
-              <w:fldChar w:fldCharType="separate"/>
-            </w:r>
-            <w:r>
-              <w:rPr>
-                <w:rFonts w:ascii="Arial Narrow" w:hAnsi="Arial Narrow"/>
-                <w:noProof/>
-              </w:rPr>
-              <w:t>S1</w:t>
-            </w:r>
-            <w:r>
-              <w:rPr>
-                <w:rFonts w:ascii="Arial Narrow" w:hAnsi="Arial Narrow"/>
-              </w:rPr>
-              <w:fldChar w:fldCharType="end"/>
+              <w:t>{PENDIDIKAN}</w:t>
             </w:r>
           </w:p>
         </w:tc>
@@ -4274,75 +3840,22 @@
                 <w:rFonts w:ascii="Arial Narrow" w:hAnsi="Arial Narrow"/>
                 <w:lang w:val="id-ID"/>
               </w:rPr>
-              <w:fldChar w:fldCharType="begin"/>
-            </w:r>
-            <w:r>
-              <w:rPr>
-                <w:rFonts w:ascii="Arial Narrow" w:hAnsi="Arial Narrow"/>
-                <w:lang w:val="id-ID"/>
-              </w:rPr>
-              <w:instrText xml:space="preserve"> MERGEFIELD "Golongan" </w:instrText>
-            </w:r>
-            <w:r>
-              <w:rPr>
-                <w:rFonts w:ascii="Arial Narrow" w:hAnsi="Arial Narrow"/>
-                <w:lang w:val="id-ID"/>
-              </w:rPr>
-              <w:fldChar w:fldCharType="separate"/>
-            </w:r>
-            <w:r>
-              <w:rPr>
-                <w:rFonts w:ascii="Arial Narrow" w:hAnsi="Arial Narrow"/>
-                <w:noProof/>
-                <w:lang w:val="id-ID"/>
-              </w:rPr>
-              <w:t>III/c</w:t>
-            </w:r>
-            <w:r>
-              <w:rPr>
-                <w:rFonts w:ascii="Arial Narrow" w:hAnsi="Arial Narrow"/>
-                <w:lang w:val="id-ID"/>
-              </w:rPr>
-              <w:fldChar w:fldCharType="end"/>
-            </w:r>
-          </w:p>
-          <w:p>
-            <w:pPr>
-              <w:jc w:val="both"/>
-              <w:rPr>
-                <w:rFonts w:ascii="Arial Narrow" w:hAnsi="Arial Narrow"/>
-              </w:rPr>
-            </w:pPr>
-            <w:r>
-              <w:rPr>
-                <w:rFonts w:ascii="Arial Narrow" w:hAnsi="Arial Narrow"/>
-              </w:rPr>
-              <w:fldChar w:fldCharType="begin"/>
-            </w:r>
-            <w:r>
-              <w:rPr>
-                <w:rFonts w:ascii="Arial Narrow" w:hAnsi="Arial Narrow"/>
-              </w:rPr>
-              <w:instrText xml:space="preserve"> MERGEFIELD "NAMA_MADRASAH" </w:instrText>
-            </w:r>
-            <w:r>
-              <w:rPr>
-                <w:rFonts w:ascii="Arial Narrow" w:hAnsi="Arial Narrow"/>
-              </w:rPr>
-              <w:fldChar w:fldCharType="separate"/>
-            </w:r>
-            <w:r>
-              <w:rPr>
-                <w:rFonts w:ascii="Arial Narrow" w:hAnsi="Arial Narrow"/>
-                <w:noProof/>
-              </w:rPr>
-              <w:t>MI Ma’arif 03 Gentasari</w:t>
-            </w:r>
-            <w:r>
-              <w:rPr>
-                <w:rFonts w:ascii="Arial Narrow" w:hAnsi="Arial Narrow"/>
-              </w:rPr>
-              <w:fldChar w:fldCharType="end"/>
+              <w:t>{GOLONGAN}</w:t>
+            </w:r>
+          </w:p>
+          <w:p>
+            <w:pPr>
+              <w:jc w:val="both"/>
+              <w:rPr>
+                <w:rFonts w:ascii="Arial Narrow" w:hAnsi="Arial Narrow"/>
+              </w:rPr>
+            </w:pPr>
+            <w:r>
+              <w:rPr>
+                <w:rFonts w:ascii="Arial Narrow" w:hAnsi="Arial Narrow"/>
+                <w:lang w:val="id-ID"/>
+              </w:rPr>
+              <w:t>{UNIT KERJA}</w:t>
             </w:r>
           </w:p>
         </w:tc>
@@ -4449,36 +3962,7 @@
                 <w:rFonts w:ascii="Arial Narrow" w:hAnsi="Arial Narrow"/>
                 <w:lang w:val="id-ID"/>
               </w:rPr>
-              <w:fldChar w:fldCharType="begin"/>
-            </w:r>
-            <w:r>
-              <w:rPr>
-                <w:rFonts w:ascii="Arial Narrow" w:hAnsi="Arial Narrow"/>
-                <w:lang w:val="id-ID"/>
-              </w:rPr>
-              <w:instrText xml:space="preserve"> MERGEFIELD "TMT_" </w:instrText>
-            </w:r>
-            <w:r>
-              <w:rPr>
-                <w:rFonts w:ascii="Arial Narrow" w:hAnsi="Arial Narrow"/>
-                <w:lang w:val="id-ID"/>
-              </w:rPr>
-              <w:fldChar w:fldCharType="separate"/>
-            </w:r>
-            <w:r>
-              <w:rPr>
-                <w:rFonts w:ascii="Arial Narrow" w:hAnsi="Arial Narrow"/>
-                <w:noProof/>
-                <w:lang w:val="id-ID"/>
-              </w:rPr>
-              <w:t>1 Juli 1994</w:t>
-            </w:r>
-            <w:r>
-              <w:rPr>
-                <w:rFonts w:ascii="Arial Narrow" w:hAnsi="Arial Narrow"/>
-                <w:lang w:val="id-ID"/>
-              </w:rPr>
-              <w:fldChar w:fldCharType="end"/>
+              <w:t>{TMT}</w:t>
             </w:r>
           </w:p>
         </w:tc>
@@ -4553,39 +4037,16 @@
             <w:r>
               <w:rPr>
                 <w:rFonts w:ascii="Arial Narrow" w:hAnsi="Arial Narrow"/>
+                <w:lang w:val="id-ID"/>
               </w:rPr>
               <w:t xml:space="preserve"> </w:t>
             </w:r>
             <w:r>
               <w:rPr>
                 <w:rFonts w:ascii="Arial Narrow" w:hAnsi="Arial Narrow"/>
-              </w:rPr>
-              <w:fldChar w:fldCharType="begin"/>
-            </w:r>
-            <w:r>
-              <w:rPr>
-                <w:rFonts w:ascii="Arial Narrow" w:hAnsi="Arial Narrow"/>
-              </w:rPr>
-              <w:instrText xml:space="preserve"> MERGEFIELD "TANGGAL_PENETAPAN_" </w:instrText>
-            </w:r>
-            <w:r>
-              <w:rPr>
-                <w:rFonts w:ascii="Arial Narrow" w:hAnsi="Arial Narrow"/>
-              </w:rPr>
-              <w:fldChar w:fldCharType="separate"/>
-            </w:r>
-            <w:r>
-              <w:rPr>
-                <w:rFonts w:ascii="Arial Narrow" w:hAnsi="Arial Narrow"/>
-                <w:noProof/>
-              </w:rPr>
-              <w:t>09 Oktober 2025</w:t>
-            </w:r>
-            <w:r>
-              <w:rPr>
-                <w:rFonts w:ascii="Arial Narrow" w:hAnsi="Arial Narrow"/>
-              </w:rPr>
-              <w:fldChar w:fldCharType="end"/>
+                <w:lang w:val="id-ID"/>
+              </w:rPr>
+              <w:t>{TANGGAL PENETAPAN}</w:t>
             </w:r>
             <w:r>
               <w:rPr>
@@ -4632,7 +4093,16 @@
                 <w:noProof/>
                 <w:lang w:val="id-ID"/>
               </w:rPr>
-              <w:t>Kepala MI Ma’arif 03 Gentasari</w:t>
+              <w:t xml:space="preserve">Kepala </w:t>
+            </w:r>
+            <w:r>
+              <w:rPr>
+                <w:rFonts w:ascii="Arial Narrow" w:hAnsi="Arial Narrow"/>
+                <w:b/>
+                <w:noProof/>
+                <w:lang w:val="id-ID"/>
+              </w:rPr>
+              <w:t>{UNIT KERJA}</w:t>
             </w:r>
             <w:r>
               <w:rPr>
@@ -4740,6 +4210,7 @@
             <w:r>
               <w:rPr>
                 <w:rFonts w:ascii="Arial Narrow" w:hAnsi="Arial Narrow"/>
+                <w:lang w:val="id-ID"/>
               </w:rPr>
               <w:t xml:space="preserve"> </w:t>
             </w:r>
@@ -4802,6 +4273,7 @@
             <w:r>
               <w:rPr>
                 <w:rFonts w:ascii="Arial Narrow" w:hAnsi="Arial Narrow"/>
+                <w:lang w:val="id-ID"/>
               </w:rPr>
               <w:t xml:space="preserve"> </w:t>
             </w:r>
@@ -4822,6 +4294,7 @@
         <w:rPr>
           <w:rFonts w:ascii="Arial Narrow" w:hAnsi="Arial Narrow"/>
           <w:b/>
+          <w:lang w:val="pt-BR"/>
         </w:rPr>
       </w:pPr>
       <w:r>
@@ -4876,32 +4349,28 @@
       <w:r>
         <w:rPr>
           <w:rFonts w:ascii="Arial Narrow" w:hAnsi="Arial Narrow"/>
+          <w:lang w:val="id-ID"/>
         </w:rPr>
         <w:tab/>
       </w:r>
       <w:r>
         <w:rPr>
           <w:rFonts w:ascii="Arial Narrow" w:hAnsi="Arial Narrow"/>
+          <w:lang w:val="id-ID"/>
         </w:rPr>
         <w:tab/>
-      </w:r>
-      <w:proofErr w:type="spellStart"/>
-      <w:r>
-        <w:rPr>
-          <w:rFonts w:ascii="Arial Narrow" w:hAnsi="Arial Narrow"/>
-        </w:rPr>
-        <w:t>Ditetapkan</w:t>
-      </w:r>
-      <w:proofErr w:type="spellEnd"/>
-      <w:r>
-        <w:rPr>
-          <w:rFonts w:ascii="Arial Narrow" w:hAnsi="Arial Narrow"/>
-        </w:rPr>
-        <w:t xml:space="preserve"> di </w:t>
       </w:r>
       <w:r>
         <w:rPr>
           <w:rFonts w:ascii="Arial Narrow" w:hAnsi="Arial Narrow"/>
+          <w:lang w:val="pt-BR"/>
+        </w:rPr>
+        <w:t xml:space="preserve">Ditetapkan di </w:t>
+      </w:r>
+      <w:r>
+        <w:rPr>
+          <w:rFonts w:ascii="Arial Narrow" w:hAnsi="Arial Narrow"/>
+          <w:lang w:val="pt-BR"/>
         </w:rPr>
         <w:tab/>
         <w:t xml:space="preserve">: </w:t>
@@ -4910,6 +4379,7 @@
         <w:rPr>
           <w:rFonts w:ascii="Arial Narrow" w:hAnsi="Arial Narrow"/>
           <w:b/>
+          <w:lang w:val="pt-BR"/>
         </w:rPr>
         <w:t>Cilacap</w:t>
       </w:r>
@@ -4919,31 +4389,20 @@
         <w:ind w:left="1399" w:firstLine="5801"/>
         <w:rPr>
           <w:rFonts w:ascii="Arial Narrow" w:hAnsi="Arial Narrow"/>
+          <w:lang w:val="pt-BR"/>
         </w:rPr>
       </w:pPr>
       <w:r>
         <w:rPr>
           <w:rFonts w:ascii="Arial Narrow" w:hAnsi="Arial Narrow"/>
+          <w:lang w:val="pt-BR"/>
         </w:rPr>
-        <w:t xml:space="preserve">Pada </w:t>
-      </w:r>
-      <w:proofErr w:type="spellStart"/>
-      <w:r>
-        <w:rPr>
-          <w:rFonts w:ascii="Arial Narrow" w:hAnsi="Arial Narrow"/>
-        </w:rPr>
-        <w:t>Tanggal</w:t>
-      </w:r>
-      <w:proofErr w:type="spellEnd"/>
-      <w:r>
-        <w:rPr>
-          <w:rFonts w:ascii="Arial Narrow" w:hAnsi="Arial Narrow"/>
-        </w:rPr>
-        <w:t xml:space="preserve"> </w:t>
+        <w:t xml:space="preserve">Pada Tanggal </w:t>
       </w:r>
       <w:r>
         <w:rPr>
           <w:rFonts w:ascii="Arial Narrow" w:hAnsi="Arial Narrow"/>
+          <w:lang w:val="pt-BR"/>
         </w:rPr>
         <w:tab/>
         <w:t xml:space="preserve">: </w:t>
@@ -4951,33 +4410,9 @@
       <w:r>
         <w:rPr>
           <w:rFonts w:ascii="Arial Narrow" w:hAnsi="Arial Narrow"/>
+          <w:lang w:val="pt-BR"/>
         </w:rPr>
-        <w:fldChar w:fldCharType="begin"/>
-      </w:r>
-      <w:r>
-        <w:rPr>
-          <w:rFonts w:ascii="Arial Narrow" w:hAnsi="Arial Narrow"/>
-        </w:rPr>
-        <w:instrText xml:space="preserve"> MERGEFIELD "TANGGAL_PENETAPAN_" </w:instrText>
-      </w:r>
-      <w:r>
-        <w:rPr>
-          <w:rFonts w:ascii="Arial Narrow" w:hAnsi="Arial Narrow"/>
-        </w:rPr>
-        <w:fldChar w:fldCharType="separate"/>
-      </w:r>
-      <w:r>
-        <w:rPr>
-          <w:rFonts w:ascii="Arial Narrow" w:hAnsi="Arial Narrow"/>
-          <w:noProof/>
-        </w:rPr>
-        <w:t>09 Oktober 2025</w:t>
-      </w:r>
-      <w:r>
-        <w:rPr>
-          <w:rFonts w:ascii="Arial Narrow" w:hAnsi="Arial Narrow"/>
-        </w:rPr>
-        <w:fldChar w:fldCharType="end"/>
+        <w:t>{TANGGAL PENETAPAN}</w:t>
       </w:r>
     </w:p>
     <w:p>
@@ -4987,6 +4422,7 @@
           <w:rFonts w:ascii="Arial Narrow" w:hAnsi="Arial Narrow"/>
           <w:sz w:val="16"/>
           <w:szCs w:val="16"/>
+          <w:lang w:val="pt-BR"/>
         </w:rPr>
       </w:pPr>
     </w:p>
@@ -4996,12 +4432,14 @@
         <w:rPr>
           <w:rFonts w:ascii="Arial Narrow" w:hAnsi="Arial Narrow"/>
           <w:b/>
+          <w:lang w:val="pt-BR"/>
         </w:rPr>
       </w:pPr>
       <w:r>
         <w:rPr>
           <w:rFonts w:ascii="Arial Narrow" w:hAnsi="Arial Narrow"/>
           <w:b/>
+          <w:lang w:val="pt-BR"/>
         </w:rPr>
         <w:t xml:space="preserve">PENGURUS CABANG NAHDLATUL ULAMA </w:t>
       </w:r>
@@ -5012,14 +4450,16 @@
         <w:rPr>
           <w:rFonts w:ascii="Arial Narrow" w:hAnsi="Arial Narrow"/>
           <w:b/>
+          <w:lang w:val="pt-BR"/>
         </w:rPr>
       </w:pPr>
       <w:r>
         <w:rPr>
           <w:rFonts w:ascii="Arial Narrow" w:hAnsi="Arial Narrow"/>
           <w:b/>
+          <w:lang w:val="pt-BR"/>
         </w:rPr>
-        <w:t xml:space="preserve">LEMBAGA PENDIDIKAN MA’ARIF </w:t>
+        <w:t>LEMBAGA PENDIDIKAN MA’ARIF CILACAP</w:t>
       </w:r>
     </w:p>
     <w:p>
@@ -5028,15 +4468,9 @@
         <w:rPr>
           <w:rFonts w:ascii="Arial Narrow" w:hAnsi="Arial Narrow"/>
           <w:b/>
+          <w:lang w:val="pt-BR"/>
         </w:rPr>
       </w:pPr>
-      <w:r>
-        <w:rPr>
-          <w:rFonts w:ascii="Arial Narrow" w:hAnsi="Arial Narrow"/>
-          <w:b/>
-        </w:rPr>
-        <w:t>KABUPATEN CILACAP</w:t>
-      </w:r>
     </w:p>
     <w:p>
       <w:pPr>
@@ -5044,6 +4478,7 @@
         <w:rPr>
           <w:rFonts w:ascii="Arial Narrow" w:hAnsi="Arial Narrow"/>
           <w:b/>
+          <w:lang w:val="pt-BR"/>
         </w:rPr>
       </w:pPr>
     </w:p>
@@ -5053,1218 +4488,251 @@
         <w:rPr>
           <w:rFonts w:ascii="Arial Narrow" w:hAnsi="Arial Narrow"/>
           <w:b/>
+          <w:lang w:val="pt-BR"/>
         </w:rPr>
       </w:pPr>
-      <w:r>
-        <w:rPr>
-          <w:rFonts w:ascii="Arial Narrow" w:hAnsi="Arial Narrow"/>
-          <w:b/>
-          <w:noProof/>
-        </w:rPr>
-        <w:drawing>
-          <wp:anchor distT="0" distB="0" distL="114300" distR="114300" simplePos="0" relativeHeight="251675648" behindDoc="1" locked="0" layoutInCell="1" allowOverlap="1" wp14:anchorId="172FFABF" wp14:editId="34FF1153">
-            <wp:simplePos x="0" y="0"/>
-            <wp:positionH relativeFrom="column">
-              <wp:posOffset>4047490</wp:posOffset>
-            </wp:positionH>
-            <wp:positionV relativeFrom="paragraph">
-              <wp:posOffset>9251315</wp:posOffset>
-            </wp:positionV>
-            <wp:extent cx="1456690" cy="1439545"/>
-            <wp:effectExtent l="0" t="0" r="0" b="8255"/>
-            <wp:wrapNone/>
-            <wp:docPr id="329519770" name="Picture 329519770"/>
-            <wp:cNvGraphicFramePr>
-              <a:graphicFrameLocks xmlns:a="http://schemas.openxmlformats.org/drawingml/2006/main" noChangeAspect="1"/>
-            </wp:cNvGraphicFramePr>
-            <a:graphic xmlns:a="http://schemas.openxmlformats.org/drawingml/2006/main">
-              <a:graphicData uri="http://schemas.openxmlformats.org/drawingml/2006/picture">
-                <pic:pic xmlns:pic="http://schemas.openxmlformats.org/drawingml/2006/picture">
-                  <pic:nvPicPr>
-                    <pic:cNvPr id="0" name="Picture 1"/>
-                    <pic:cNvPicPr>
-                      <a:picLocks noChangeAspect="1" noChangeArrowheads="1"/>
-                    </pic:cNvPicPr>
-                  </pic:nvPicPr>
-                  <pic:blipFill>
-                    <a:blip r:embed="rId9">
-                      <a:extLst>
-                        <a:ext uri="{28A0092B-C50C-407E-A947-70E740481C1C}">
-                          <a14:useLocalDpi xmlns:a14="http://schemas.microsoft.com/office/drawing/2010/main" val="0"/>
-                        </a:ext>
-                      </a:extLst>
-                    </a:blip>
-                    <a:srcRect l="9685" t="22395" r="15308" b="21944"/>
-                    <a:stretch>
-                      <a:fillRect/>
-                    </a:stretch>
-                  </pic:blipFill>
-                  <pic:spPr bwMode="auto">
-                    <a:xfrm>
-                      <a:off x="0" y="0"/>
-                      <a:ext cx="1456690" cy="1439545"/>
-                    </a:xfrm>
-                    <a:prstGeom prst="rect">
-                      <a:avLst/>
-                    </a:prstGeom>
-                    <a:noFill/>
-                    <a:ln>
-                      <a:noFill/>
-                    </a:ln>
-                  </pic:spPr>
-                </pic:pic>
-              </a:graphicData>
-            </a:graphic>
-            <wp14:sizeRelH relativeFrom="page">
-              <wp14:pctWidth>0</wp14:pctWidth>
-            </wp14:sizeRelH>
-            <wp14:sizeRelV relativeFrom="page">
-              <wp14:pctHeight>0</wp14:pctHeight>
-            </wp14:sizeRelV>
-          </wp:anchor>
-        </w:drawing>
-      </w:r>
-      <w:r>
-        <w:rPr>
-          <w:rFonts w:ascii="Arial Narrow" w:hAnsi="Arial Narrow"/>
-          <w:b/>
-          <w:noProof/>
-        </w:rPr>
-        <w:drawing>
-          <wp:anchor distT="0" distB="0" distL="114300" distR="114300" simplePos="0" relativeHeight="251673600" behindDoc="1" locked="0" layoutInCell="1" allowOverlap="1" wp14:anchorId="4163666A" wp14:editId="1D5CCB79">
-            <wp:simplePos x="0" y="0"/>
-            <wp:positionH relativeFrom="column">
-              <wp:posOffset>4906645</wp:posOffset>
-            </wp:positionH>
-            <wp:positionV relativeFrom="paragraph">
-              <wp:posOffset>9259570</wp:posOffset>
-            </wp:positionV>
-            <wp:extent cx="1381125" cy="904875"/>
-            <wp:effectExtent l="0" t="0" r="9525" b="9525"/>
-            <wp:wrapNone/>
-            <wp:docPr id="719266877" name="Picture 719266877" descr="G:\ttd P. Amrul.jpg"/>
-            <wp:cNvGraphicFramePr>
-              <a:graphicFrameLocks xmlns:a="http://schemas.openxmlformats.org/drawingml/2006/main" noChangeAspect="1"/>
-            </wp:cNvGraphicFramePr>
-            <a:graphic xmlns:a="http://schemas.openxmlformats.org/drawingml/2006/main">
-              <a:graphicData uri="http://schemas.openxmlformats.org/drawingml/2006/picture">
-                <pic:pic xmlns:pic="http://schemas.openxmlformats.org/drawingml/2006/picture">
-                  <pic:nvPicPr>
-                    <pic:cNvPr id="0" name="Picture 990316575" descr="G:\ttd P. Amrul.jpg"/>
-                    <pic:cNvPicPr>
-                      <a:picLocks noChangeAspect="1" noChangeArrowheads="1"/>
-                    </pic:cNvPicPr>
-                  </pic:nvPicPr>
-                  <pic:blipFill>
-                    <a:blip r:embed="rId10">
-                      <a:extLst>
-                        <a:ext uri="{28A0092B-C50C-407E-A947-70E740481C1C}">
-                          <a14:useLocalDpi xmlns:a14="http://schemas.microsoft.com/office/drawing/2010/main" val="0"/>
-                        </a:ext>
-                      </a:extLst>
-                    </a:blip>
-                    <a:srcRect/>
-                    <a:stretch>
-                      <a:fillRect/>
-                    </a:stretch>
-                  </pic:blipFill>
-                  <pic:spPr bwMode="auto">
-                    <a:xfrm>
-                      <a:off x="0" y="0"/>
-                      <a:ext cx="1381125" cy="904875"/>
-                    </a:xfrm>
-                    <a:prstGeom prst="rect">
-                      <a:avLst/>
-                    </a:prstGeom>
-                    <a:noFill/>
-                    <a:ln>
-                      <a:noFill/>
-                    </a:ln>
-                  </pic:spPr>
-                </pic:pic>
-              </a:graphicData>
-            </a:graphic>
-            <wp14:sizeRelH relativeFrom="page">
-              <wp14:pctWidth>0</wp14:pctWidth>
-            </wp14:sizeRelH>
-            <wp14:sizeRelV relativeFrom="page">
-              <wp14:pctHeight>0</wp14:pctHeight>
-            </wp14:sizeRelV>
-          </wp:anchor>
-        </w:drawing>
-      </w:r>
-      <w:r>
-        <w:rPr>
-          <w:rFonts w:ascii="Arial Narrow" w:hAnsi="Arial Narrow"/>
-          <w:b/>
-          <w:noProof/>
-        </w:rPr>
-        <w:drawing>
-          <wp:anchor distT="0" distB="0" distL="114300" distR="114300" simplePos="0" relativeHeight="251671552" behindDoc="1" locked="0" layoutInCell="1" allowOverlap="1" wp14:anchorId="0BF6A811" wp14:editId="109A561E">
-            <wp:simplePos x="0" y="0"/>
-            <wp:positionH relativeFrom="column">
-              <wp:posOffset>1132840</wp:posOffset>
-            </wp:positionH>
-            <wp:positionV relativeFrom="paragraph">
-              <wp:posOffset>9018270</wp:posOffset>
-            </wp:positionV>
-            <wp:extent cx="1882775" cy="1447800"/>
-            <wp:effectExtent l="0" t="0" r="3175" b="0"/>
-            <wp:wrapNone/>
-            <wp:docPr id="1804461508" name="Picture 1804461508"/>
-            <wp:cNvGraphicFramePr>
-              <a:graphicFrameLocks xmlns:a="http://schemas.openxmlformats.org/drawingml/2006/main" noChangeAspect="1"/>
-            </wp:cNvGraphicFramePr>
-            <a:graphic xmlns:a="http://schemas.openxmlformats.org/drawingml/2006/main">
-              <a:graphicData uri="http://schemas.openxmlformats.org/drawingml/2006/picture">
-                <pic:pic xmlns:pic="http://schemas.openxmlformats.org/drawingml/2006/picture">
-                  <pic:nvPicPr>
-                    <pic:cNvPr id="0" name="Picture 16877402"/>
-                    <pic:cNvPicPr>
-                      <a:picLocks noChangeAspect="1" noChangeArrowheads="1"/>
-                    </pic:cNvPicPr>
-                  </pic:nvPicPr>
-                  <pic:blipFill>
-                    <a:blip r:embed="rId11">
-                      <a:grayscl/>
-                      <a:biLevel thresh="50000"/>
-                      <a:extLst>
-                        <a:ext uri="{28A0092B-C50C-407E-A947-70E740481C1C}">
-                          <a14:useLocalDpi xmlns:a14="http://schemas.microsoft.com/office/drawing/2010/main" val="0"/>
-                        </a:ext>
-                      </a:extLst>
-                    </a:blip>
-                    <a:srcRect/>
-                    <a:stretch>
-                      <a:fillRect/>
-                    </a:stretch>
-                  </pic:blipFill>
-                  <pic:spPr bwMode="auto">
-                    <a:xfrm>
-                      <a:off x="0" y="0"/>
-                      <a:ext cx="1882775" cy="1447800"/>
-                    </a:xfrm>
-                    <a:prstGeom prst="rect">
-                      <a:avLst/>
-                    </a:prstGeom>
-                    <a:noFill/>
-                    <a:ln>
-                      <a:noFill/>
-                    </a:ln>
-                  </pic:spPr>
-                </pic:pic>
-              </a:graphicData>
-            </a:graphic>
-            <wp14:sizeRelH relativeFrom="page">
-              <wp14:pctWidth>0</wp14:pctWidth>
-            </wp14:sizeRelH>
-            <wp14:sizeRelV relativeFrom="page">
-              <wp14:pctHeight>0</wp14:pctHeight>
-            </wp14:sizeRelV>
-          </wp:anchor>
-        </w:drawing>
-      </w:r>
     </w:p>
+    <w:tbl>
+      <w:tblPr>
+        <w:tblStyle w:val="TableGrid"/>
+        <w:tblW w:w="5000" w:type="pct"/>
+        <w:tblBorders>
+          <w:top w:val="none" w:sz="0" w:space="0" w:color="auto"/>
+          <w:left w:val="none" w:sz="0" w:space="0" w:color="auto"/>
+          <w:bottom w:val="none" w:sz="0" w:space="0" w:color="auto"/>
+          <w:right w:val="none" w:sz="0" w:space="0" w:color="auto"/>
+          <w:insideH w:val="none" w:sz="0" w:space="0" w:color="auto"/>
+          <w:insideV w:val="none" w:sz="0" w:space="0" w:color="auto"/>
+        </w:tblBorders>
+        <w:tblLook w:val="04A0" w:firstRow="1" w:lastRow="0" w:firstColumn="1" w:lastColumn="0" w:noHBand="0" w:noVBand="1"/>
+      </w:tblPr>
+      <w:tblGrid>
+        <w:gridCol w:w="5270"/>
+        <w:gridCol w:w="5270"/>
+      </w:tblGrid>
+      <w:tr>
+        <w:trPr>
+          <w:trHeight w:val="277"/>
+        </w:trPr>
+        <w:tc>
+          <w:tcPr>
+            <w:tcW w:w="2500" w:type="pct"/>
+            <w:vAlign w:val="center"/>
+          </w:tcPr>
+          <w:p>
+            <w:pPr>
+              <w:jc w:val="center"/>
+              <w:rPr>
+                <w:rFonts w:ascii="Arial Narrow" w:hAnsi="Arial Narrow"/>
+                <w:b/>
+                <w:noProof/>
+              </w:rPr>
+            </w:pPr>
+          </w:p>
+          <w:p>
+            <w:pPr>
+              <w:jc w:val="center"/>
+              <w:rPr>
+                <w:rFonts w:ascii="Arial Narrow" w:hAnsi="Arial Narrow"/>
+                <w:b/>
+                <w:u w:val="single"/>
+              </w:rPr>
+            </w:pPr>
+            <w:r>
+              <w:rPr>
+                <w:rFonts w:ascii="Arial Narrow" w:hAnsi="Arial Narrow"/>
+                <w:b/>
+                <w:bCs/>
+              </w:rPr>
+              <w:t xml:space="preserve">                       </w:t>
+            </w:r>
+            <w:r>
+              <w:rPr>
+                <w:rFonts w:ascii="Arial Narrow" w:hAnsi="Arial Narrow"/>
+                <w:b/>
+                <w:bCs/>
+                <w:u w:val="single"/>
+              </w:rPr>
+              <w:t>H. ALI SODIQIN, S.Ag., M.Pd.I</w:t>
+            </w:r>
+          </w:p>
+          <w:p>
+            <w:pPr>
+              <w:jc w:val="center"/>
+              <w:rPr>
+                <w:rFonts w:ascii="Arial Narrow" w:hAnsi="Arial Narrow"/>
+              </w:rPr>
+            </w:pPr>
+            <w:r>
+              <w:rPr>
+                <w:rFonts w:ascii="Arial Narrow" w:hAnsi="Arial Narrow"/>
+              </w:rPr>
+              <w:t xml:space="preserve">                     </w:t>
+            </w:r>
+            <w:r>
+              <w:rPr>
+                <w:rFonts w:ascii="Arial Narrow" w:hAnsi="Arial Narrow"/>
+              </w:rPr>
+              <w:t>Ketua</w:t>
+            </w:r>
+          </w:p>
+        </w:tc>
+        <w:tc>
+          <w:tcPr>
+            <w:tcW w:w="2500" w:type="pct"/>
+            <w:vAlign w:val="center"/>
+          </w:tcPr>
+          <w:p>
+            <w:pPr>
+              <w:jc w:val="center"/>
+              <w:rPr>
+                <w:rFonts w:ascii="Arial Narrow" w:hAnsi="Arial Narrow"/>
+                <w:b/>
+                <w:u w:val="single"/>
+              </w:rPr>
+            </w:pPr>
+          </w:p>
+          <w:p>
+            <w:pPr>
+              <w:rPr>
+                <w:rFonts w:ascii="Arial Narrow" w:hAnsi="Arial Narrow"/>
+              </w:rPr>
+            </w:pPr>
+            <w:r>
+              <w:rPr>
+                <w:rFonts w:ascii="Arial Narrow" w:hAnsi="Arial Narrow"/>
+                <w:b/>
+                <w:bCs/>
+              </w:rPr>
+              <w:t xml:space="preserve">                    </w:t>
+            </w:r>
+            <w:r>
+              <w:rPr>
+                <w:rFonts w:ascii="Arial Narrow" w:hAnsi="Arial Narrow"/>
+                <w:b/>
+                <w:bCs/>
+                <w:u w:val="single"/>
+              </w:rPr>
+              <w:t>NGADINO, S.Pd.I</w:t>
+            </w:r>
+          </w:p>
+          <w:p>
+            <w:pPr>
+              <w:rPr>
+                <w:rFonts w:ascii="Arial Narrow" w:hAnsi="Arial Narrow"/>
+                <w:sz w:val="16"/>
+                <w:szCs w:val="16"/>
+              </w:rPr>
+            </w:pPr>
+            <w:r>
+              <w:rPr>
+                <w:rFonts w:ascii="Arial Narrow" w:hAnsi="Arial Narrow"/>
+              </w:rPr>
+              <w:t xml:space="preserve">                          </w:t>
+            </w:r>
+            <w:r>
+              <w:rPr>
+                <w:rFonts w:ascii="Arial Narrow" w:hAnsi="Arial Narrow"/>
+              </w:rPr>
+              <w:t>Sekretaris</w:t>
+            </w:r>
+          </w:p>
+        </w:tc>
+      </w:tr>
+      <w:tr>
+        <w:tc>
+          <w:tcPr>
+            <w:tcW w:w="2500" w:type="pct"/>
+          </w:tcPr>
+          <w:p>
+            <w:pPr>
+              <w:rPr>
+                <w:rFonts w:ascii="Arial Narrow" w:hAnsi="Arial Narrow"/>
+              </w:rPr>
+            </w:pPr>
+            <w:r>
+              <w:rPr>
+                <w:rFonts w:ascii="Arial Narrow" w:hAnsi="Arial Narrow"/>
+              </w:rPr>
+              <w:t>Tembusan dikrim Kepada Yth.</w:t>
+            </w:r>
+          </w:p>
+          <w:p>
+            <w:pPr>
+              <w:pStyle w:val="ListParagraph"/>
+              <w:ind w:left="746" w:hanging="37"/>
+              <w:rPr>
+                <w:rFonts w:ascii="Arial Narrow" w:hAnsi="Arial Narrow"/>
+              </w:rPr>
+            </w:pPr>
+            <w:r>
+              <w:rPr>
+                <w:rFonts w:ascii="Arial Narrow" w:hAnsi="Arial Narrow"/>
+              </w:rPr>
+              <w:t>{#tembusan}</w:t>
+            </w:r>
+          </w:p>
+          <w:p>
+            <w:pPr>
+              <w:pStyle w:val="ListParagraph"/>
+              <w:ind w:left="746" w:hanging="37"/>
+              <w:rPr>
+                <w:rFonts w:ascii="Arial Narrow" w:hAnsi="Arial Narrow"/>
+              </w:rPr>
+            </w:pPr>
+            <w:r>
+              <w:rPr>
+                <w:rFonts w:ascii="Arial Narrow" w:hAnsi="Arial Narrow"/>
+              </w:rPr>
+              <w:t>{nomor}. {isi}</w:t>
+            </w:r>
+          </w:p>
+          <w:p>
+            <w:pPr>
+              <w:pStyle w:val="ListParagraph"/>
+              <w:ind w:left="746" w:hanging="37"/>
+              <w:rPr>
+                <w:lang w:val="sv-SE"/>
+              </w:rPr>
+            </w:pPr>
+            <w:r>
+              <w:rPr>
+                <w:rFonts w:ascii="Arial Narrow" w:hAnsi="Arial Narrow"/>
+              </w:rPr>
+              <w:t>{/tembusan}</w:t>
+            </w:r>
+          </w:p>
+        </w:tc>
+        <w:tc>
+          <w:tcPr>
+            <w:tcW w:w="2500" w:type="pct"/>
+          </w:tcPr>
+          <w:p>
+            <w:pPr>
+              <w:jc w:val="right"/>
+              <w:rPr>
+                <w:lang w:val="sv-SE"/>
+              </w:rPr>
+            </w:pPr>
+            <w:r>
+              <w:t>{%qrcode}</w:t>
+            </w:r>
+          </w:p>
+        </w:tc>
+      </w:tr>
+    </w:tbl>
     <w:p>
       <w:pPr>
         <w:jc w:val="center"/>
         <w:rPr>
           <w:rFonts w:ascii="Arial Narrow" w:hAnsi="Arial Narrow"/>
           <w:b/>
+          <w:lang w:val="pt-BR"/>
         </w:rPr>
       </w:pPr>
-    </w:p>
-    <w:p>
-      <w:pPr>
-        <w:rPr>
-          <w:rFonts w:ascii="Arial Narrow" w:hAnsi="Arial Narrow"/>
-          <w:b/>
-        </w:rPr>
-      </w:pPr>
-      <w:r>
-        <w:rPr>
-          <w:rFonts w:ascii="Arial Narrow" w:hAnsi="Arial Narrow"/>
-          <w:b/>
-          <w:noProof/>
-        </w:rPr>
-        <w:drawing>
-          <wp:anchor distT="0" distB="0" distL="114300" distR="114300" simplePos="0" relativeHeight="251670528" behindDoc="1" locked="0" layoutInCell="1" allowOverlap="1" wp14:anchorId="0BE66A62" wp14:editId="218BEEE5">
-            <wp:simplePos x="0" y="0"/>
-            <wp:positionH relativeFrom="column">
-              <wp:posOffset>4650740</wp:posOffset>
-            </wp:positionH>
-            <wp:positionV relativeFrom="paragraph">
-              <wp:posOffset>9467850</wp:posOffset>
-            </wp:positionV>
-            <wp:extent cx="1805305" cy="506730"/>
-            <wp:effectExtent l="19050" t="0" r="4445" b="0"/>
-            <wp:wrapNone/>
-            <wp:docPr id="4" name="Picture 4" descr="TOPIKK"/>
-            <wp:cNvGraphicFramePr>
-              <a:graphicFrameLocks xmlns:a="http://schemas.openxmlformats.org/drawingml/2006/main" noChangeAspect="1"/>
-            </wp:cNvGraphicFramePr>
-            <a:graphic xmlns:a="http://schemas.openxmlformats.org/drawingml/2006/main">
-              <a:graphicData uri="http://schemas.openxmlformats.org/drawingml/2006/picture">
-                <pic:pic xmlns:pic="http://schemas.openxmlformats.org/drawingml/2006/picture">
-                  <pic:nvPicPr>
-                    <pic:cNvPr id="0" name="Picture 4" descr="TOPIKK"/>
-                    <pic:cNvPicPr>
-                      <a:picLocks noChangeAspect="1" noChangeArrowheads="1"/>
-                    </pic:cNvPicPr>
-                  </pic:nvPicPr>
-                  <pic:blipFill>
-                    <a:blip r:embed="rId12" cstate="print"/>
-                    <a:srcRect/>
-                    <a:stretch>
-                      <a:fillRect/>
-                    </a:stretch>
-                  </pic:blipFill>
-                  <pic:spPr bwMode="auto">
-                    <a:xfrm>
-                      <a:off x="0" y="0"/>
-                      <a:ext cx="1805305" cy="506730"/>
-                    </a:xfrm>
-                    <a:prstGeom prst="rect">
-                      <a:avLst/>
-                    </a:prstGeom>
-                    <a:noFill/>
-                    <a:ln w="9525">
-                      <a:noFill/>
-                      <a:miter lim="800000"/>
-                      <a:headEnd/>
-                      <a:tailEnd/>
-                    </a:ln>
-                  </pic:spPr>
-                </pic:pic>
-              </a:graphicData>
-            </a:graphic>
-          </wp:anchor>
-        </w:drawing>
-      </w:r>
-    </w:p>
-    <w:p>
-      <w:pPr>
-        <w:ind w:left="1440" w:firstLine="720"/>
-        <w:rPr>
-          <w:rFonts w:ascii="Arial Narrow" w:hAnsi="Arial Narrow"/>
-          <w:b/>
-          <w:bCs/>
-        </w:rPr>
-      </w:pPr>
-      <w:r>
-        <w:rPr>
-          <w:rFonts w:ascii="Arial Narrow" w:hAnsi="Arial Narrow"/>
-          <w:b/>
-          <w:bCs/>
-          <w:noProof/>
-          <w:u w:val="single"/>
-        </w:rPr>
-        <w:drawing>
-          <wp:anchor distT="0" distB="0" distL="114300" distR="114300" simplePos="0" relativeHeight="251672576" behindDoc="1" locked="0" layoutInCell="1" allowOverlap="1" wp14:anchorId="10589100" wp14:editId="30BF5D41">
-            <wp:simplePos x="0" y="0"/>
-            <wp:positionH relativeFrom="column">
-              <wp:posOffset>1739900</wp:posOffset>
-            </wp:positionH>
-            <wp:positionV relativeFrom="paragraph">
-              <wp:posOffset>8971915</wp:posOffset>
-            </wp:positionV>
-            <wp:extent cx="1047750" cy="981075"/>
-            <wp:effectExtent l="76200" t="57150" r="57150" b="47625"/>
-            <wp:wrapNone/>
-            <wp:docPr id="1624814602" name="Picture 0" descr="kakine.jpg"/>
-            <wp:cNvGraphicFramePr>
-              <a:graphicFrameLocks xmlns:a="http://schemas.openxmlformats.org/drawingml/2006/main" noChangeAspect="1"/>
-            </wp:cNvGraphicFramePr>
-            <a:graphic xmlns:a="http://schemas.openxmlformats.org/drawingml/2006/main">
-              <a:graphicData uri="http://schemas.openxmlformats.org/drawingml/2006/picture">
-                <pic:pic xmlns:pic="http://schemas.openxmlformats.org/drawingml/2006/picture">
-                  <pic:nvPicPr>
-                    <pic:cNvPr id="0" name="Picture 0" descr="kakine.jpg"/>
-                    <pic:cNvPicPr>
-                      <a:picLocks noChangeAspect="1" noChangeArrowheads="1"/>
-                    </pic:cNvPicPr>
-                  </pic:nvPicPr>
-                  <pic:blipFill>
-                    <a:blip r:embed="rId13" cstate="print">
-                      <a:lum bright="-50000" contrast="70000"/>
-                    </a:blip>
-                    <a:srcRect/>
-                    <a:stretch>
-                      <a:fillRect/>
-                    </a:stretch>
-                  </pic:blipFill>
-                  <pic:spPr bwMode="auto">
-                    <a:xfrm rot="-418683">
-                      <a:off x="0" y="0"/>
-                      <a:ext cx="1047750" cy="981075"/>
-                    </a:xfrm>
-                    <a:prstGeom prst="rect">
-                      <a:avLst/>
-                    </a:prstGeom>
-                    <a:noFill/>
-                    <a:ln w="9525">
-                      <a:noFill/>
-                      <a:miter lim="800000"/>
-                      <a:headEnd/>
-                      <a:tailEnd/>
-                    </a:ln>
-                  </pic:spPr>
-                </pic:pic>
-              </a:graphicData>
-            </a:graphic>
-          </wp:anchor>
-        </w:drawing>
-      </w:r>
-      <w:r>
-        <w:rPr>
-          <w:rFonts w:ascii="Arial Narrow" w:hAnsi="Arial Narrow"/>
-          <w:b/>
-          <w:bCs/>
-          <w:noProof/>
-          <w:u w:val="single"/>
-        </w:rPr>
-        <w:drawing>
-          <wp:anchor distT="0" distB="0" distL="114300" distR="114300" simplePos="0" relativeHeight="251676672" behindDoc="1" locked="0" layoutInCell="1" allowOverlap="1" wp14:anchorId="38695F8E" wp14:editId="3D83955D">
-            <wp:simplePos x="0" y="0"/>
-            <wp:positionH relativeFrom="column">
-              <wp:posOffset>4615180</wp:posOffset>
-            </wp:positionH>
-            <wp:positionV relativeFrom="paragraph">
-              <wp:posOffset>8862695</wp:posOffset>
-            </wp:positionV>
-            <wp:extent cx="1805305" cy="506730"/>
-            <wp:effectExtent l="19050" t="0" r="4445" b="0"/>
-            <wp:wrapNone/>
-            <wp:docPr id="2055035128" name="Picture 2055035128" descr="TOPIKK"/>
-            <wp:cNvGraphicFramePr>
-              <a:graphicFrameLocks xmlns:a="http://schemas.openxmlformats.org/drawingml/2006/main" noChangeAspect="1"/>
-            </wp:cNvGraphicFramePr>
-            <a:graphic xmlns:a="http://schemas.openxmlformats.org/drawingml/2006/main">
-              <a:graphicData uri="http://schemas.openxmlformats.org/drawingml/2006/picture">
-                <pic:pic xmlns:pic="http://schemas.openxmlformats.org/drawingml/2006/picture">
-                  <pic:nvPicPr>
-                    <pic:cNvPr id="0" name="Picture 8" descr="TOPIKK"/>
-                    <pic:cNvPicPr>
-                      <a:picLocks noChangeAspect="1" noChangeArrowheads="1"/>
-                    </pic:cNvPicPr>
-                  </pic:nvPicPr>
-                  <pic:blipFill>
-                    <a:blip r:embed="rId12" cstate="print"/>
-                    <a:srcRect/>
-                    <a:stretch>
-                      <a:fillRect/>
-                    </a:stretch>
-                  </pic:blipFill>
-                  <pic:spPr bwMode="auto">
-                    <a:xfrm>
-                      <a:off x="0" y="0"/>
-                      <a:ext cx="1805305" cy="506730"/>
-                    </a:xfrm>
-                    <a:prstGeom prst="rect">
-                      <a:avLst/>
-                    </a:prstGeom>
-                    <a:noFill/>
-                    <a:ln w="9525">
-                      <a:noFill/>
-                      <a:miter lim="800000"/>
-                      <a:headEnd/>
-                      <a:tailEnd/>
-                    </a:ln>
-                  </pic:spPr>
-                </pic:pic>
-              </a:graphicData>
-            </a:graphic>
-          </wp:anchor>
-        </w:drawing>
-      </w:r>
-      <w:r>
-        <w:rPr>
-          <w:rFonts w:ascii="Arial Narrow" w:hAnsi="Arial Narrow"/>
-          <w:b/>
-          <w:bCs/>
-          <w:noProof/>
-          <w:u w:val="single"/>
-        </w:rPr>
-        <w:drawing>
-          <wp:anchor distT="0" distB="0" distL="114300" distR="114300" simplePos="0" relativeHeight="251674624" behindDoc="1" locked="0" layoutInCell="1" allowOverlap="1" wp14:anchorId="7C05F543" wp14:editId="0B9EFB70">
-            <wp:simplePos x="0" y="0"/>
-            <wp:positionH relativeFrom="column">
-              <wp:posOffset>1828800</wp:posOffset>
-            </wp:positionH>
-            <wp:positionV relativeFrom="paragraph">
-              <wp:posOffset>8571865</wp:posOffset>
-            </wp:positionV>
-            <wp:extent cx="1047750" cy="981075"/>
-            <wp:effectExtent l="76200" t="57150" r="57150" b="47625"/>
-            <wp:wrapNone/>
-            <wp:docPr id="470716841" name="Picture 0" descr="kakine.jpg"/>
-            <wp:cNvGraphicFramePr>
-              <a:graphicFrameLocks xmlns:a="http://schemas.openxmlformats.org/drawingml/2006/main" noChangeAspect="1"/>
-            </wp:cNvGraphicFramePr>
-            <a:graphic xmlns:a="http://schemas.openxmlformats.org/drawingml/2006/main">
-              <a:graphicData uri="http://schemas.openxmlformats.org/drawingml/2006/picture">
-                <pic:pic xmlns:pic="http://schemas.openxmlformats.org/drawingml/2006/picture">
-                  <pic:nvPicPr>
-                    <pic:cNvPr id="0" name="Picture 0" descr="kakine.jpg"/>
-                    <pic:cNvPicPr>
-                      <a:picLocks noChangeAspect="1" noChangeArrowheads="1"/>
-                    </pic:cNvPicPr>
-                  </pic:nvPicPr>
-                  <pic:blipFill>
-                    <a:blip r:embed="rId13" cstate="print">
-                      <a:lum bright="-50000" contrast="70000"/>
-                    </a:blip>
-                    <a:srcRect/>
-                    <a:stretch>
-                      <a:fillRect/>
-                    </a:stretch>
-                  </pic:blipFill>
-                  <pic:spPr bwMode="auto">
-                    <a:xfrm rot="-418683">
-                      <a:off x="0" y="0"/>
-                      <a:ext cx="1047750" cy="981075"/>
-                    </a:xfrm>
-                    <a:prstGeom prst="rect">
-                      <a:avLst/>
-                    </a:prstGeom>
-                    <a:noFill/>
-                    <a:ln w="9525">
-                      <a:noFill/>
-                      <a:miter lim="800000"/>
-                      <a:headEnd/>
-                      <a:tailEnd/>
-                    </a:ln>
-                  </pic:spPr>
-                </pic:pic>
-              </a:graphicData>
-            </a:graphic>
-          </wp:anchor>
-        </w:drawing>
-      </w:r>
-      <w:r>
-        <w:rPr>
-          <w:rFonts w:ascii="Arial Narrow" w:hAnsi="Arial Narrow"/>
-          <w:b/>
-          <w:bCs/>
-          <w:u w:val="single"/>
-        </w:rPr>
-        <w:t xml:space="preserve">ALI SODIQIN, </w:t>
-      </w:r>
-      <w:proofErr w:type="spellStart"/>
-      <w:r>
-        <w:rPr>
-          <w:rFonts w:ascii="Arial Narrow" w:hAnsi="Arial Narrow"/>
-          <w:b/>
-          <w:bCs/>
-          <w:u w:val="single"/>
-        </w:rPr>
-        <w:t>S.Ag</w:t>
-      </w:r>
-      <w:proofErr w:type="spellEnd"/>
-      <w:r>
-        <w:rPr>
-          <w:rFonts w:ascii="Arial Narrow" w:hAnsi="Arial Narrow"/>
-          <w:b/>
-          <w:bCs/>
-          <w:u w:val="single"/>
-        </w:rPr>
-        <w:t xml:space="preserve">., </w:t>
-      </w:r>
-      <w:proofErr w:type="spellStart"/>
-      <w:r>
-        <w:rPr>
-          <w:rFonts w:ascii="Arial Narrow" w:hAnsi="Arial Narrow"/>
-          <w:b/>
-          <w:bCs/>
-          <w:u w:val="single"/>
-        </w:rPr>
-        <w:t>M.</w:t>
-      </w:r>
-      <w:proofErr w:type="gramStart"/>
-      <w:r>
-        <w:rPr>
-          <w:rFonts w:ascii="Arial Narrow" w:hAnsi="Arial Narrow"/>
-          <w:b/>
-          <w:bCs/>
-          <w:u w:val="single"/>
-        </w:rPr>
-        <w:t>Pd.I</w:t>
-      </w:r>
-      <w:proofErr w:type="spellEnd"/>
-      <w:proofErr w:type="gramEnd"/>
-      <w:r>
-        <w:rPr>
-          <w:rFonts w:ascii="Arial Narrow" w:hAnsi="Arial Narrow"/>
-          <w:b/>
-          <w:bCs/>
-        </w:rPr>
-        <w:tab/>
-      </w:r>
-      <w:r>
-        <w:rPr>
-          <w:rFonts w:ascii="Arial Narrow" w:hAnsi="Arial Narrow"/>
-          <w:b/>
-          <w:bCs/>
-        </w:rPr>
-        <w:tab/>
-      </w:r>
-      <w:r>
-        <w:rPr>
-          <w:rFonts w:ascii="Arial Narrow" w:hAnsi="Arial Narrow"/>
-          <w:b/>
-          <w:bCs/>
-        </w:rPr>
-        <w:tab/>
-      </w:r>
-      <w:r>
-        <w:rPr>
-          <w:rFonts w:ascii="Arial Narrow" w:hAnsi="Arial Narrow"/>
-          <w:b/>
-          <w:bCs/>
-        </w:rPr>
-        <w:tab/>
-      </w:r>
-      <w:r>
-        <w:rPr>
-          <w:rFonts w:ascii="Arial Narrow" w:hAnsi="Arial Narrow"/>
-          <w:b/>
-          <w:bCs/>
-          <w:u w:val="single"/>
-        </w:rPr>
-        <w:t xml:space="preserve">NGADINO, </w:t>
-      </w:r>
-      <w:proofErr w:type="spellStart"/>
-      <w:r>
-        <w:rPr>
-          <w:rFonts w:ascii="Arial Narrow" w:hAnsi="Arial Narrow"/>
-          <w:b/>
-          <w:bCs/>
-          <w:u w:val="single"/>
-        </w:rPr>
-        <w:t>S.</w:t>
-      </w:r>
-      <w:proofErr w:type="gramStart"/>
-      <w:r>
-        <w:rPr>
-          <w:rFonts w:ascii="Arial Narrow" w:hAnsi="Arial Narrow"/>
-          <w:b/>
-          <w:bCs/>
-          <w:u w:val="single"/>
-        </w:rPr>
-        <w:t>Pd.I</w:t>
-      </w:r>
-      <w:proofErr w:type="spellEnd"/>
-      <w:proofErr w:type="gramEnd"/>
-    </w:p>
-    <w:p>
-      <w:pPr>
-        <w:ind w:left="2160" w:firstLine="720"/>
-        <w:rPr>
-          <w:rFonts w:ascii="Arial Narrow" w:hAnsi="Arial Narrow"/>
-          <w:b/>
-          <w:bCs/>
-          <w:i/>
-          <w:iCs/>
-        </w:rPr>
-      </w:pPr>
-      <w:proofErr w:type="spellStart"/>
-      <w:r>
-        <w:rPr>
-          <w:rFonts w:ascii="Arial Narrow" w:hAnsi="Arial Narrow"/>
-          <w:b/>
-          <w:bCs/>
-          <w:i/>
-          <w:iCs/>
-        </w:rPr>
-        <w:t>Ketua</w:t>
-      </w:r>
-      <w:proofErr w:type="spellEnd"/>
-      <w:r>
-        <w:rPr>
-          <w:rFonts w:ascii="Arial Narrow" w:hAnsi="Arial Narrow"/>
-          <w:b/>
-          <w:bCs/>
-          <w:i/>
-          <w:iCs/>
-        </w:rPr>
-        <w:t xml:space="preserve"> </w:t>
-      </w:r>
-      <w:r>
-        <w:rPr>
-          <w:rFonts w:ascii="Arial Narrow" w:hAnsi="Arial Narrow"/>
-          <w:b/>
-          <w:bCs/>
-          <w:i/>
-          <w:iCs/>
-        </w:rPr>
-        <w:tab/>
-      </w:r>
-      <w:r>
-        <w:rPr>
-          <w:rFonts w:ascii="Arial Narrow" w:hAnsi="Arial Narrow"/>
-          <w:b/>
-          <w:bCs/>
-          <w:i/>
-          <w:iCs/>
-        </w:rPr>
-        <w:tab/>
-      </w:r>
-      <w:proofErr w:type="gramStart"/>
-      <w:r>
-        <w:rPr>
-          <w:rFonts w:ascii="Arial Narrow" w:hAnsi="Arial Narrow"/>
-          <w:b/>
-          <w:bCs/>
-          <w:i/>
-          <w:iCs/>
-        </w:rPr>
-        <w:tab/>
-        <w:t xml:space="preserve">  </w:t>
-      </w:r>
-      <w:r>
-        <w:rPr>
-          <w:rFonts w:ascii="Arial Narrow" w:hAnsi="Arial Narrow"/>
-          <w:b/>
-          <w:bCs/>
-          <w:i/>
-          <w:iCs/>
-        </w:rPr>
-        <w:tab/>
-      </w:r>
-      <w:proofErr w:type="gramEnd"/>
-      <w:r>
-        <w:rPr>
-          <w:rFonts w:ascii="Arial Narrow" w:hAnsi="Arial Narrow"/>
-          <w:b/>
-          <w:bCs/>
-          <w:i/>
-          <w:iCs/>
-        </w:rPr>
-        <w:t xml:space="preserve">          </w:t>
-      </w:r>
-      <w:r>
-        <w:rPr>
-          <w:rFonts w:ascii="Arial Narrow" w:hAnsi="Arial Narrow"/>
-          <w:b/>
-          <w:bCs/>
-          <w:i/>
-          <w:iCs/>
-        </w:rPr>
-        <w:tab/>
-      </w:r>
-      <w:r>
-        <w:rPr>
-          <w:rFonts w:ascii="Arial Narrow" w:hAnsi="Arial Narrow"/>
-          <w:b/>
-          <w:bCs/>
-          <w:i/>
-          <w:iCs/>
-        </w:rPr>
-        <w:t xml:space="preserve">    </w:t>
-      </w:r>
-      <w:r>
-        <w:rPr>
-          <w:rFonts w:ascii="Arial Narrow" w:hAnsi="Arial Narrow"/>
-          <w:b/>
-          <w:bCs/>
-          <w:i/>
-          <w:iCs/>
-        </w:rPr>
-        <w:t xml:space="preserve"> </w:t>
-      </w:r>
-      <w:proofErr w:type="spellStart"/>
-      <w:r>
-        <w:rPr>
-          <w:rFonts w:ascii="Arial Narrow" w:hAnsi="Arial Narrow"/>
-          <w:b/>
-          <w:bCs/>
-          <w:i/>
-          <w:iCs/>
-        </w:rPr>
-        <w:t>Sekretaris</w:t>
-      </w:r>
-      <w:proofErr w:type="spellEnd"/>
-    </w:p>
-    <w:p>
-      <w:pPr>
-        <w:rPr>
-          <w:rFonts w:ascii="Arial Narrow" w:hAnsi="Arial Narrow"/>
-        </w:rPr>
-      </w:pPr>
-      <w:r>
-        <w:rPr>
-          <w:rFonts w:ascii="Arial Narrow" w:hAnsi="Arial Narrow"/>
-          <w:noProof/>
-        </w:rPr>
-        <w:drawing>
-          <wp:anchor distT="0" distB="0" distL="114300" distR="114300" simplePos="0" relativeHeight="251637760" behindDoc="1" locked="0" layoutInCell="1" allowOverlap="1" wp14:anchorId="5A3E5F3E" wp14:editId="25D8A44B">
-            <wp:simplePos x="0" y="0"/>
-            <wp:positionH relativeFrom="column">
-              <wp:posOffset>1739900</wp:posOffset>
-            </wp:positionH>
-            <wp:positionV relativeFrom="paragraph">
-              <wp:posOffset>8971915</wp:posOffset>
-            </wp:positionV>
-            <wp:extent cx="1047750" cy="981075"/>
-            <wp:effectExtent l="76200" t="57150" r="57150" b="47625"/>
-            <wp:wrapNone/>
-            <wp:docPr id="3" name="Picture 0" descr="kakine.jpg"/>
-            <wp:cNvGraphicFramePr>
-              <a:graphicFrameLocks xmlns:a="http://schemas.openxmlformats.org/drawingml/2006/main" noChangeAspect="1"/>
-            </wp:cNvGraphicFramePr>
-            <a:graphic xmlns:a="http://schemas.openxmlformats.org/drawingml/2006/main">
-              <a:graphicData uri="http://schemas.openxmlformats.org/drawingml/2006/picture">
-                <pic:pic xmlns:pic="http://schemas.openxmlformats.org/drawingml/2006/picture">
-                  <pic:nvPicPr>
-                    <pic:cNvPr id="0" name="Picture 0" descr="kakine.jpg"/>
-                    <pic:cNvPicPr>
-                      <a:picLocks noChangeAspect="1" noChangeArrowheads="1"/>
-                    </pic:cNvPicPr>
-                  </pic:nvPicPr>
-                  <pic:blipFill>
-                    <a:blip r:embed="rId13" cstate="print">
-                      <a:lum bright="-50000" contrast="70000"/>
-                    </a:blip>
-                    <a:srcRect/>
-                    <a:stretch>
-                      <a:fillRect/>
-                    </a:stretch>
-                  </pic:blipFill>
-                  <pic:spPr bwMode="auto">
-                    <a:xfrm rot="-418683">
-                      <a:off x="0" y="0"/>
-                      <a:ext cx="1047750" cy="981075"/>
-                    </a:xfrm>
-                    <a:prstGeom prst="rect">
-                      <a:avLst/>
-                    </a:prstGeom>
-                    <a:noFill/>
-                    <a:ln w="9525">
-                      <a:noFill/>
-                      <a:miter lim="800000"/>
-                      <a:headEnd/>
-                      <a:tailEnd/>
-                    </a:ln>
-                  </pic:spPr>
-                </pic:pic>
-              </a:graphicData>
-            </a:graphic>
-          </wp:anchor>
-        </w:drawing>
-      </w:r>
-      <w:r>
-        <w:rPr>
-          <w:rFonts w:ascii="Arial Narrow" w:hAnsi="Arial Narrow"/>
-          <w:noProof/>
-        </w:rPr>
-        <w:drawing>
-          <wp:anchor distT="0" distB="0" distL="114300" distR="114300" simplePos="0" relativeHeight="251656192" behindDoc="1" locked="0" layoutInCell="1" allowOverlap="1" wp14:anchorId="032391C3" wp14:editId="069BA861">
-            <wp:simplePos x="0" y="0"/>
-            <wp:positionH relativeFrom="column">
-              <wp:posOffset>4615180</wp:posOffset>
-            </wp:positionH>
-            <wp:positionV relativeFrom="paragraph">
-              <wp:posOffset>8862695</wp:posOffset>
-            </wp:positionV>
-            <wp:extent cx="1805305" cy="506730"/>
-            <wp:effectExtent l="19050" t="0" r="4445" b="0"/>
-            <wp:wrapNone/>
-            <wp:docPr id="8" name="Picture 8" descr="TOPIKK"/>
-            <wp:cNvGraphicFramePr>
-              <a:graphicFrameLocks xmlns:a="http://schemas.openxmlformats.org/drawingml/2006/main" noChangeAspect="1"/>
-            </wp:cNvGraphicFramePr>
-            <a:graphic xmlns:a="http://schemas.openxmlformats.org/drawingml/2006/main">
-              <a:graphicData uri="http://schemas.openxmlformats.org/drawingml/2006/picture">
-                <pic:pic xmlns:pic="http://schemas.openxmlformats.org/drawingml/2006/picture">
-                  <pic:nvPicPr>
-                    <pic:cNvPr id="0" name="Picture 8" descr="TOPIKK"/>
-                    <pic:cNvPicPr>
-                      <a:picLocks noChangeAspect="1" noChangeArrowheads="1"/>
-                    </pic:cNvPicPr>
-                  </pic:nvPicPr>
-                  <pic:blipFill>
-                    <a:blip r:embed="rId12" cstate="print"/>
-                    <a:srcRect/>
-                    <a:stretch>
-                      <a:fillRect/>
-                    </a:stretch>
-                  </pic:blipFill>
-                  <pic:spPr bwMode="auto">
-                    <a:xfrm>
-                      <a:off x="0" y="0"/>
-                      <a:ext cx="1805305" cy="506730"/>
-                    </a:xfrm>
-                    <a:prstGeom prst="rect">
-                      <a:avLst/>
-                    </a:prstGeom>
-                    <a:noFill/>
-                    <a:ln w="9525">
-                      <a:noFill/>
-                      <a:miter lim="800000"/>
-                      <a:headEnd/>
-                      <a:tailEnd/>
-                    </a:ln>
-                  </pic:spPr>
-                </pic:pic>
-              </a:graphicData>
-            </a:graphic>
-          </wp:anchor>
-        </w:drawing>
-      </w:r>
-      <w:r>
-        <w:rPr>
-          <w:rFonts w:ascii="Arial Narrow" w:hAnsi="Arial Narrow"/>
-          <w:noProof/>
-        </w:rPr>
-        <w:drawing>
-          <wp:anchor distT="0" distB="0" distL="114300" distR="114300" simplePos="0" relativeHeight="251646976" behindDoc="1" locked="0" layoutInCell="1" allowOverlap="1" wp14:anchorId="1C97501C" wp14:editId="73E8F57C">
-            <wp:simplePos x="0" y="0"/>
-            <wp:positionH relativeFrom="column">
-              <wp:posOffset>1828800</wp:posOffset>
-            </wp:positionH>
-            <wp:positionV relativeFrom="paragraph">
-              <wp:posOffset>8571865</wp:posOffset>
-            </wp:positionV>
-            <wp:extent cx="1047750" cy="981075"/>
-            <wp:effectExtent l="76200" t="57150" r="57150" b="47625"/>
-            <wp:wrapNone/>
-            <wp:docPr id="6" name="Picture 0" descr="kakine.jpg"/>
-            <wp:cNvGraphicFramePr>
-              <a:graphicFrameLocks xmlns:a="http://schemas.openxmlformats.org/drawingml/2006/main" noChangeAspect="1"/>
-            </wp:cNvGraphicFramePr>
-            <a:graphic xmlns:a="http://schemas.openxmlformats.org/drawingml/2006/main">
-              <a:graphicData uri="http://schemas.openxmlformats.org/drawingml/2006/picture">
-                <pic:pic xmlns:pic="http://schemas.openxmlformats.org/drawingml/2006/picture">
-                  <pic:nvPicPr>
-                    <pic:cNvPr id="0" name="Picture 0" descr="kakine.jpg"/>
-                    <pic:cNvPicPr>
-                      <a:picLocks noChangeAspect="1" noChangeArrowheads="1"/>
-                    </pic:cNvPicPr>
-                  </pic:nvPicPr>
-                  <pic:blipFill>
-                    <a:blip r:embed="rId13" cstate="print">
-                      <a:lum bright="-50000" contrast="70000"/>
-                    </a:blip>
-                    <a:srcRect/>
-                    <a:stretch>
-                      <a:fillRect/>
-                    </a:stretch>
-                  </pic:blipFill>
-                  <pic:spPr bwMode="auto">
-                    <a:xfrm rot="-418683">
-                      <a:off x="0" y="0"/>
-                      <a:ext cx="1047750" cy="981075"/>
-                    </a:xfrm>
-                    <a:prstGeom prst="rect">
-                      <a:avLst/>
-                    </a:prstGeom>
-                    <a:noFill/>
-                    <a:ln w="9525">
-                      <a:noFill/>
-                      <a:miter lim="800000"/>
-                      <a:headEnd/>
-                      <a:tailEnd/>
-                    </a:ln>
-                  </pic:spPr>
-                </pic:pic>
-              </a:graphicData>
-            </a:graphic>
-          </wp:anchor>
-        </w:drawing>
-      </w:r>
-      <w:proofErr w:type="spellStart"/>
-      <w:r>
-        <w:rPr>
-          <w:rFonts w:ascii="Arial Narrow" w:hAnsi="Arial Narrow"/>
-        </w:rPr>
-        <w:t>Tembusan</w:t>
-      </w:r>
-      <w:proofErr w:type="spellEnd"/>
-      <w:r>
-        <w:rPr>
-          <w:rFonts w:ascii="Arial Narrow" w:hAnsi="Arial Narrow"/>
-        </w:rPr>
-        <w:t xml:space="preserve"> </w:t>
-      </w:r>
-      <w:proofErr w:type="spellStart"/>
-      <w:r>
-        <w:rPr>
-          <w:rFonts w:ascii="Arial Narrow" w:hAnsi="Arial Narrow"/>
-        </w:rPr>
-        <w:t>dikrim</w:t>
-      </w:r>
-      <w:proofErr w:type="spellEnd"/>
-      <w:r>
-        <w:rPr>
-          <w:rFonts w:ascii="Arial Narrow" w:hAnsi="Arial Narrow"/>
-        </w:rPr>
-        <w:t xml:space="preserve"> </w:t>
-      </w:r>
-      <w:proofErr w:type="spellStart"/>
-      <w:r>
-        <w:rPr>
-          <w:rFonts w:ascii="Arial Narrow" w:hAnsi="Arial Narrow"/>
-        </w:rPr>
-        <w:t>Kepada</w:t>
-      </w:r>
-      <w:proofErr w:type="spellEnd"/>
-      <w:r>
-        <w:rPr>
-          <w:rFonts w:ascii="Arial Narrow" w:hAnsi="Arial Narrow"/>
-        </w:rPr>
-        <w:t xml:space="preserve"> </w:t>
-      </w:r>
-      <w:proofErr w:type="spellStart"/>
-      <w:r>
-        <w:rPr>
-          <w:rFonts w:ascii="Arial Narrow" w:hAnsi="Arial Narrow"/>
-        </w:rPr>
-        <w:t>Yth</w:t>
-      </w:r>
-      <w:proofErr w:type="spellEnd"/>
-      <w:r>
-        <w:rPr>
-          <w:rFonts w:ascii="Arial Narrow" w:hAnsi="Arial Narrow"/>
-        </w:rPr>
-        <w:t>.</w:t>
-      </w:r>
-    </w:p>
-    <w:p>
-      <w:pPr>
-        <w:pStyle w:val="ListParagraph"/>
-        <w:numPr>
-          <w:ilvl w:val="0"/>
-          <w:numId w:val="3"/>
-        </w:numPr>
-        <w:rPr>
-          <w:rFonts w:ascii="Arial Narrow" w:hAnsi="Arial Narrow"/>
-        </w:rPr>
-      </w:pPr>
-      <w:r>
-        <w:rPr>
-          <w:rFonts w:ascii="Arial Narrow" w:hAnsi="Arial Narrow"/>
-        </w:rPr>
-        <w:t xml:space="preserve">PW LP </w:t>
-      </w:r>
-      <w:proofErr w:type="spellStart"/>
-      <w:r>
-        <w:rPr>
-          <w:rFonts w:ascii="Arial Narrow" w:hAnsi="Arial Narrow"/>
-        </w:rPr>
-        <w:t>Ma’arif</w:t>
-      </w:r>
-      <w:proofErr w:type="spellEnd"/>
-      <w:r>
-        <w:rPr>
-          <w:rFonts w:ascii="Arial Narrow" w:hAnsi="Arial Narrow"/>
-        </w:rPr>
-        <w:t xml:space="preserve"> NU Jawa Tengah </w:t>
-      </w:r>
-    </w:p>
-    <w:p>
-      <w:pPr>
-        <w:pStyle w:val="ListParagraph"/>
-        <w:numPr>
-          <w:ilvl w:val="0"/>
-          <w:numId w:val="3"/>
-        </w:numPr>
-        <w:rPr>
-          <w:rFonts w:ascii="Arial Narrow" w:hAnsi="Arial Narrow"/>
-        </w:rPr>
-      </w:pPr>
-      <w:proofErr w:type="spellStart"/>
-      <w:r>
-        <w:rPr>
-          <w:rFonts w:ascii="Arial Narrow" w:hAnsi="Arial Narrow"/>
-        </w:rPr>
-        <w:t>Pengurus</w:t>
-      </w:r>
-      <w:proofErr w:type="spellEnd"/>
-      <w:r>
-        <w:rPr>
-          <w:rFonts w:ascii="Arial Narrow" w:hAnsi="Arial Narrow"/>
-        </w:rPr>
-        <w:t xml:space="preserve"> Cabang NU </w:t>
-      </w:r>
-      <w:proofErr w:type="spellStart"/>
-      <w:r>
-        <w:rPr>
-          <w:rFonts w:ascii="Arial Narrow" w:hAnsi="Arial Narrow"/>
-        </w:rPr>
-        <w:t>Kabupaten</w:t>
-      </w:r>
-      <w:proofErr w:type="spellEnd"/>
-      <w:r>
-        <w:rPr>
-          <w:rFonts w:ascii="Arial Narrow" w:hAnsi="Arial Narrow"/>
-        </w:rPr>
-        <w:t xml:space="preserve"> Cilacap</w:t>
-      </w:r>
-    </w:p>
-    <w:p>
-      <w:pPr>
-        <w:pStyle w:val="ListParagraph"/>
-        <w:numPr>
-          <w:ilvl w:val="0"/>
-          <w:numId w:val="3"/>
-        </w:numPr>
-        <w:rPr>
-          <w:rFonts w:ascii="Arial Narrow" w:hAnsi="Arial Narrow"/>
-        </w:rPr>
-      </w:pPr>
-      <w:r>
-        <w:rPr>
-          <w:rFonts w:ascii="Arial Narrow" w:hAnsi="Arial Narrow"/>
-        </w:rPr>
-        <w:t xml:space="preserve">MWC LP </w:t>
-      </w:r>
-      <w:proofErr w:type="spellStart"/>
-      <w:r>
-        <w:rPr>
-          <w:rFonts w:ascii="Arial Narrow" w:hAnsi="Arial Narrow"/>
-        </w:rPr>
-        <w:t>Ma’arif</w:t>
-      </w:r>
-      <w:proofErr w:type="spellEnd"/>
-      <w:r>
-        <w:rPr>
-          <w:rFonts w:ascii="Arial Narrow" w:hAnsi="Arial Narrow"/>
-        </w:rPr>
-        <w:t xml:space="preserve"> NU </w:t>
-      </w:r>
-      <w:proofErr w:type="spellStart"/>
-      <w:r>
-        <w:rPr>
-          <w:rFonts w:ascii="Arial Narrow" w:hAnsi="Arial Narrow"/>
-        </w:rPr>
-        <w:t>Kecamatan</w:t>
-      </w:r>
-      <w:proofErr w:type="spellEnd"/>
-      <w:r>
-        <w:rPr>
-          <w:rFonts w:ascii="Arial Narrow" w:hAnsi="Arial Narrow"/>
-        </w:rPr>
-        <w:t xml:space="preserve"> </w:t>
-      </w:r>
-      <w:r>
-        <w:rPr>
-          <w:rFonts w:ascii="Arial Narrow" w:hAnsi="Arial Narrow"/>
-        </w:rPr>
-        <w:fldChar w:fldCharType="begin"/>
-      </w:r>
-      <w:r>
-        <w:rPr>
-          <w:rFonts w:ascii="Arial Narrow" w:hAnsi="Arial Narrow"/>
-        </w:rPr>
-        <w:instrText xml:space="preserve"> MERGEFIELD "KECAMATAN" </w:instrText>
-      </w:r>
-      <w:r>
-        <w:rPr>
-          <w:rFonts w:ascii="Arial Narrow" w:hAnsi="Arial Narrow"/>
-        </w:rPr>
-        <w:fldChar w:fldCharType="separate"/>
-      </w:r>
-      <w:r>
-        <w:rPr>
-          <w:rFonts w:ascii="Arial Narrow" w:hAnsi="Arial Narrow"/>
-          <w:noProof/>
-        </w:rPr>
-        <w:t>Kroya</w:t>
-      </w:r>
-      <w:r>
-        <w:rPr>
-          <w:rFonts w:ascii="Arial Narrow" w:hAnsi="Arial Narrow"/>
-        </w:rPr>
-        <w:fldChar w:fldCharType="end"/>
-      </w:r>
-    </w:p>
-    <w:p>
-      <w:pPr>
-        <w:pStyle w:val="ListParagraph"/>
-        <w:numPr>
-          <w:ilvl w:val="0"/>
-          <w:numId w:val="3"/>
-        </w:numPr>
-        <w:rPr>
-          <w:rFonts w:ascii="Arial Narrow" w:hAnsi="Arial Narrow"/>
-          <w:noProof/>
-        </w:rPr>
-      </w:pPr>
-      <w:proofErr w:type="spellStart"/>
-      <w:r>
-        <w:rPr>
-          <w:rFonts w:ascii="Arial Narrow" w:hAnsi="Arial Narrow"/>
-        </w:rPr>
-        <w:t>Kepala</w:t>
-      </w:r>
-      <w:proofErr w:type="spellEnd"/>
-      <w:r>
-        <w:rPr>
-          <w:rFonts w:ascii="Arial Narrow" w:hAnsi="Arial Narrow"/>
-        </w:rPr>
-        <w:t xml:space="preserve">  </w:t>
-      </w:r>
-      <w:r>
-        <w:rPr>
-          <w:rFonts w:ascii="Arial Narrow" w:hAnsi="Arial Narrow"/>
-        </w:rPr>
-        <w:fldChar w:fldCharType="begin"/>
-      </w:r>
-      <w:r>
-        <w:rPr>
-          <w:rFonts w:ascii="Arial Narrow" w:hAnsi="Arial Narrow"/>
-        </w:rPr>
-        <w:instrText xml:space="preserve"> MERGEFIELD "NAMA_MADRASAH" </w:instrText>
-      </w:r>
-      <w:r>
-        <w:rPr>
-          <w:rFonts w:ascii="Arial Narrow" w:hAnsi="Arial Narrow"/>
-        </w:rPr>
-        <w:fldChar w:fldCharType="separate"/>
-      </w:r>
-      <w:r>
-        <w:rPr>
-          <w:rFonts w:ascii="Arial Narrow" w:hAnsi="Arial Narrow"/>
-          <w:noProof/>
-        </w:rPr>
-        <w:t>MI Ma’arif 03 Gentasari</w:t>
-      </w:r>
-      <w:r>
-        <w:rPr>
-          <w:rFonts w:ascii="Arial Narrow" w:hAnsi="Arial Narrow"/>
-        </w:rPr>
-        <w:fldChar w:fldCharType="end"/>
-      </w:r>
-    </w:p>
-    <w:p>
-      <w:pPr>
-        <w:pStyle w:val="ListParagraph"/>
-        <w:numPr>
-          <w:ilvl w:val="0"/>
-          <w:numId w:val="3"/>
-        </w:numPr>
-        <w:rPr>
-          <w:lang w:val="sv-SE"/>
-        </w:rPr>
-      </w:pPr>
-      <w:proofErr w:type="spellStart"/>
-      <w:r>
-        <w:rPr>
-          <w:rFonts w:ascii="Arial Narrow" w:hAnsi="Arial Narrow"/>
-        </w:rPr>
-        <w:t>Arsip</w:t>
-      </w:r>
-      <w:proofErr w:type="spellEnd"/>
-      <w:r>
-        <w:rPr>
-          <w:rFonts w:ascii="Arial Narrow" w:hAnsi="Arial Narrow"/>
-          <w:noProof/>
-        </w:rPr>
-        <w:t xml:space="preserve"> </w:t>
-      </w:r>
     </w:p>
     <w:sectPr>
-      <w:headerReference w:type="default" r:id="rId14"/>
+      <w:headerReference w:type="default" r:id="rId9"/>
       <w:pgSz w:w="12242" w:h="18711" w:code="5"/>
       <w:pgMar w:top="1814" w:right="851" w:bottom="284" w:left="851" w:header="510" w:footer="720" w:gutter="0"/>
       <w:cols w:space="720"/>
@@ -6325,6 +4793,7 @@
         <w:color w:val="008E40"/>
         <w:sz w:val="28"/>
         <w:szCs w:val="28"/>
+        <w:lang w:val="pt-BR"/>
       </w:rPr>
     </w:pPr>
     <w:r>
@@ -6387,6 +4856,7 @@
         <w:color w:val="008E40"/>
         <w:sz w:val="28"/>
         <w:szCs w:val="28"/>
+        <w:lang w:val="pt-BR"/>
       </w:rPr>
       <w:t>PENGURUS CABANG NAHDLATUL ULAMA CILACAP</w:t>
     </w:r>
@@ -6402,6 +4872,7 @@
         <w:color w:val="008E40"/>
         <w:sz w:val="28"/>
         <w:szCs w:val="28"/>
+        <w:lang w:val="pt-BR"/>
       </w:rPr>
     </w:pPr>
     <w:r>
@@ -6412,6 +4883,7 @@
         <w:color w:val="008E40"/>
         <w:sz w:val="28"/>
         <w:szCs w:val="28"/>
+        <w:lang w:val="pt-BR"/>
       </w:rPr>
       <w:t>LEMBAGA PENDIDIKAN MAARIF NU</w:t>
     </w:r>
@@ -6427,25 +4899,15 @@
         <w:szCs w:val="24"/>
       </w:rPr>
     </w:pPr>
-    <w:proofErr w:type="spellStart"/>
     <w:r>
       <w:rPr>
         <w:rFonts w:ascii="Arial Narrow" w:hAnsi="Arial Narrow"/>
         <w:color w:val="000000" w:themeColor="text1"/>
         <w:sz w:val="24"/>
         <w:szCs w:val="24"/>
+        <w:lang w:val="pt-BR"/>
       </w:rPr>
-      <w:t>Jl</w:t>
-    </w:r>
-    <w:proofErr w:type="spellEnd"/>
-    <w:r>
-      <w:rPr>
-        <w:rFonts w:ascii="Arial Narrow" w:hAnsi="Arial Narrow"/>
-        <w:color w:val="000000" w:themeColor="text1"/>
-        <w:sz w:val="24"/>
-        <w:szCs w:val="24"/>
-      </w:rPr>
-      <w:t xml:space="preserve"> Masjid N</w:t>
+      <w:t xml:space="preserve">Jl Masjid No I/36 Kel.Sidanegara Kec. </w:t>
     </w:r>
     <w:r>
       <w:rPr>
@@ -6454,56 +4916,7 @@
         <w:sz w:val="24"/>
         <w:szCs w:val="24"/>
       </w:rPr>
-      <w:t>o</w:t>
-    </w:r>
-    <w:r>
-      <w:rPr>
-        <w:rFonts w:ascii="Arial Narrow" w:hAnsi="Arial Narrow"/>
-        <w:color w:val="000000" w:themeColor="text1"/>
-        <w:sz w:val="24"/>
-        <w:szCs w:val="24"/>
-      </w:rPr>
-      <w:t xml:space="preserve"> I/36 </w:t>
-    </w:r>
-    <w:proofErr w:type="spellStart"/>
-    <w:r>
-      <w:rPr>
-        <w:rFonts w:ascii="Arial Narrow" w:hAnsi="Arial Narrow"/>
-        <w:color w:val="000000" w:themeColor="text1"/>
-        <w:sz w:val="24"/>
-        <w:szCs w:val="24"/>
-      </w:rPr>
-      <w:t>Kel.Sidanegara</w:t>
-    </w:r>
-    <w:proofErr w:type="spellEnd"/>
-    <w:r>
-      <w:rPr>
-        <w:rFonts w:ascii="Arial Narrow" w:hAnsi="Arial Narrow"/>
-        <w:color w:val="000000" w:themeColor="text1"/>
-        <w:sz w:val="24"/>
-        <w:szCs w:val="24"/>
-      </w:rPr>
-      <w:t xml:space="preserve"> </w:t>
-    </w:r>
-    <w:proofErr w:type="spellStart"/>
-    <w:r>
-      <w:rPr>
-        <w:rFonts w:ascii="Arial Narrow" w:hAnsi="Arial Narrow"/>
-        <w:color w:val="000000" w:themeColor="text1"/>
-        <w:sz w:val="24"/>
-        <w:szCs w:val="24"/>
-      </w:rPr>
-      <w:t>Kec</w:t>
-    </w:r>
-    <w:proofErr w:type="spellEnd"/>
-    <w:r>
-      <w:rPr>
-        <w:rFonts w:ascii="Arial Narrow" w:hAnsi="Arial Narrow"/>
-        <w:color w:val="000000" w:themeColor="text1"/>
-        <w:sz w:val="24"/>
-        <w:szCs w:val="24"/>
-      </w:rPr>
-      <w:t>. C</w:t>
+      <w:t>C</w:t>
     </w:r>
     <w:r>
       <w:rPr>
@@ -7880,6 +6293,12 @@
   <wne:recipientData>
     <wne:active wne:val="1"/>
     <wne:hash wne:val="-348798452"/>
+  </wne:recipientData>
+  <wne:recipientData>
+    <wne:active wne:val="1"/>
+  </wne:recipientData>
+  <wne:recipientData>
+    <wne:active wne:val="1"/>
   </wne:recipientData>
   <wne:recipientData>
     <wne:active wne:val="1"/>

</xml_diff>